<commit_message>
feat(media): add Playback Options autoPlay setting and Open Link action buttons
</commit_message>
<xml_diff>
--- a/Top_Gospel_Music_of_the_Week.docx
+++ b/Top_Gospel_Music_of_the_Week.docx
@@ -4,14 +4,13 @@
   <w:body>
     <w:p>
       <w:pPr>
-        <w:pStyle w:val="Title"/>
         <w:jc w:val="center"/>
       </w:pPr>
       <w:r>
         <w:rPr>
-          <w:rFonts w:ascii="Arial" w:hAnsi="Arial"/>
+          <w:rFonts w:ascii="Georgia" w:hAnsi="Georgia"/>
           <w:b/>
-          <w:color w:val="1E3A8A"/>
+          <w:color w:val="1B365D"/>
           <w:sz w:val="52"/>
         </w:rPr>
         <w:t>Top Gospel Music of the Week</w:t>
@@ -19,53 +18,81 @@
     </w:p>
     <w:p>
       <w:pPr>
+        <w:spacing w:after="360"/>
         <w:jc w:val="center"/>
       </w:pPr>
       <w:r>
         <w:rPr>
-          <w:rFonts w:ascii="Arial" w:hAnsi="Arial"/>
+          <w:rFonts w:ascii="Calibri" w:hAnsi="Calibri"/>
           <w:i/>
-          <w:color w:val="4B5563"/>
-          <w:sz w:val="24"/>
+          <w:color w:val="556B82"/>
+          <w:sz w:val="26"/>
         </w:rPr>
-        <w:t>Top Charting Gospel Songs, Official Links &amp; Lyrics • Week of July 31, 2026</w:t>
+        <w:t>Billboard &amp; Trending Gospel Hits | Links &amp; Full Lyrics</w:t>
+        <w:br/>
+        <w:t>Week of August 7, 2026</w:t>
       </w:r>
     </w:p>
-    <w:p/>
     <w:p>
       <w:pPr>
-        <w:pStyle w:val="Heading2"/>
+        <w:spacing w:after="280"/>
+        <w:jc w:val="center"/>
       </w:pPr>
       <w:r>
         <w:rPr>
-          <w:color w:val="1E3A8A"/>
+          <w:color w:val="D0D7DE"/>
         </w:rPr>
-        <w:t>Weekly Chart Summary</w:t>
+        <w:t>―――――――――――――――――――――――――――――――――――――――――――――――――――――――</w:t>
+      </w:r>
+    </w:p>
+    <w:p>
+      <w:pPr>
+        <w:spacing w:before="200" w:after="160"/>
+      </w:pPr>
+      <w:r>
+        <w:rPr>
+          <w:rFonts w:ascii="Georgia" w:hAnsi="Georgia"/>
+          <w:b/>
+          <w:color w:val="1B365D"/>
+          <w:sz w:val="32"/>
+        </w:rPr>
+        <w:t>Weekly Chart Overview</w:t>
       </w:r>
     </w:p>
     <w:tbl>
       <w:tblPr>
-        <w:tblStyle w:val="TableGrid"/>
         <w:tblW w:type="auto" w:w="0"/>
+        <w:jc w:val="center"/>
+        <w:tblLayout w:type="fixed"/>
         <w:tblLook w:firstColumn="1" w:firstRow="1" w:lastColumn="0" w:lastRow="0" w:noHBand="0" w:noVBand="1" w:val="04A0"/>
       </w:tblPr>
       <w:tblGrid>
-        <w:gridCol w:w="2340"/>
-        <w:gridCol w:w="2340"/>
-        <w:gridCol w:w="2340"/>
-        <w:gridCol w:w="2340"/>
+        <w:gridCol w:w="2484"/>
+        <w:gridCol w:w="2484"/>
+        <w:gridCol w:w="2484"/>
+        <w:gridCol w:w="2484"/>
       </w:tblGrid>
       <w:tr>
         <w:tc>
           <w:tcPr>
-            <w:tcW w:type="dxa" w:w="2340"/>
-            <w:shd w:fill="1E3A8A"/>
+            <w:tcW w:type="dxa" w:w="720"/>
+            <w:shd w:fill="1B365D"/>
+            <w:tcMar>
+              <w:top w:w="120" w:type="dxa"/>
+              <w:bottom w:w="120" w:type="dxa"/>
+              <w:left w:w="150" w:type="dxa"/>
+              <w:right w:w="150" w:type="dxa"/>
+            </w:tcMar>
           </w:tcPr>
           <w:p>
+            <w:pPr>
+              <w:jc w:val="center"/>
+            </w:pPr>
             <w:r>
               <w:rPr>
                 <w:b/>
                 <w:color w:val="FFFFFF"/>
+                <w:sz w:val="20"/>
               </w:rPr>
               <w:t>#</w:t>
             </w:r>
@@ -73,14 +100,24 @@
         </w:tc>
         <w:tc>
           <w:tcPr>
-            <w:tcW w:type="dxa" w:w="2340"/>
-            <w:shd w:fill="1E3A8A"/>
+            <w:tcW w:type="dxa" w:w="3168"/>
+            <w:shd w:fill="1B365D"/>
+            <w:tcMar>
+              <w:top w:w="120" w:type="dxa"/>
+              <w:bottom w:w="120" w:type="dxa"/>
+              <w:left w:w="150" w:type="dxa"/>
+              <w:right w:w="150" w:type="dxa"/>
+            </w:tcMar>
           </w:tcPr>
           <w:p>
+            <w:pPr>
+              <w:jc w:val="left"/>
+            </w:pPr>
             <w:r>
               <w:rPr>
                 <w:b/>
                 <w:color w:val="FFFFFF"/>
+                <w:sz w:val="20"/>
               </w:rPr>
               <w:t>Song Title</w:t>
             </w:r>
@@ -88,14 +125,24 @@
         </w:tc>
         <w:tc>
           <w:tcPr>
-            <w:tcW w:type="dxa" w:w="2340"/>
-            <w:shd w:fill="1E3A8A"/>
+            <w:tcW w:type="dxa" w:w="3312"/>
+            <w:shd w:fill="1B365D"/>
+            <w:tcMar>
+              <w:top w:w="120" w:type="dxa"/>
+              <w:bottom w:w="120" w:type="dxa"/>
+              <w:left w:w="150" w:type="dxa"/>
+              <w:right w:w="150" w:type="dxa"/>
+            </w:tcMar>
           </w:tcPr>
           <w:p>
+            <w:pPr>
+              <w:jc w:val="left"/>
+            </w:pPr>
             <w:r>
               <w:rPr>
                 <w:b/>
                 <w:color w:val="FFFFFF"/>
+                <w:sz w:val="20"/>
               </w:rPr>
               <w:t>Artist</w:t>
             </w:r>
@@ -103,16 +150,26 @@
         </w:tc>
         <w:tc>
           <w:tcPr>
-            <w:tcW w:type="dxa" w:w="2340"/>
-            <w:shd w:fill="1E3A8A"/>
+            <w:tcW w:type="dxa" w:w="2592"/>
+            <w:shd w:fill="1B365D"/>
+            <w:tcMar>
+              <w:top w:w="120" w:type="dxa"/>
+              <w:bottom w:w="120" w:type="dxa"/>
+              <w:left w:w="150" w:type="dxa"/>
+              <w:right w:w="150" w:type="dxa"/>
+            </w:tcMar>
           </w:tcPr>
           <w:p>
+            <w:pPr>
+              <w:jc w:val="left"/>
+            </w:pPr>
             <w:r>
               <w:rPr>
                 <w:b/>
                 <w:color w:val="FFFFFF"/>
+                <w:sz w:val="20"/>
               </w:rPr>
-              <w:t>Official Link</w:t>
+              <w:t>Media Link</w:t>
             </w:r>
           </w:p>
         </w:tc>
@@ -120,27 +177,57 @@
       <w:tr>
         <w:tc>
           <w:tcPr>
-            <w:tcW w:type="dxa" w:w="2340"/>
+            <w:tcW w:type="dxa" w:w="2484"/>
+            <w:shd w:fill="FFFFFF"/>
+            <w:tcMar>
+              <w:top w:w="100" w:type="dxa"/>
+              <w:bottom w:w="100" w:type="dxa"/>
+              <w:left w:w="150" w:type="dxa"/>
+              <w:right w:w="150" w:type="dxa"/>
+            </w:tcMar>
           </w:tcPr>
           <w:p>
+            <w:pPr>
+              <w:jc w:val="center"/>
+            </w:pPr>
             <w:r>
+              <w:rPr>
+                <w:b/>
+              </w:rPr>
               <w:t>1</w:t>
             </w:r>
           </w:p>
         </w:tc>
         <w:tc>
           <w:tcPr>
-            <w:tcW w:type="dxa" w:w="2340"/>
+            <w:tcW w:type="dxa" w:w="2484"/>
+            <w:shd w:fill="FFFFFF"/>
+            <w:tcMar>
+              <w:top w:w="100" w:type="dxa"/>
+              <w:bottom w:w="100" w:type="dxa"/>
+              <w:left w:w="150" w:type="dxa"/>
+              <w:right w:w="150" w:type="dxa"/>
+            </w:tcMar>
           </w:tcPr>
           <w:p>
             <w:r>
+              <w:rPr>
+                <w:b/>
+              </w:rPr>
               <w:t>Goodness of God</w:t>
             </w:r>
           </w:p>
         </w:tc>
         <w:tc>
           <w:tcPr>
-            <w:tcW w:type="dxa" w:w="2340"/>
+            <w:tcW w:type="dxa" w:w="2484"/>
+            <w:shd w:fill="FFFFFF"/>
+            <w:tcMar>
+              <w:top w:w="100" w:type="dxa"/>
+              <w:bottom w:w="100" w:type="dxa"/>
+              <w:left w:w="150" w:type="dxa"/>
+              <w:right w:w="150" w:type="dxa"/>
+            </w:tcMar>
           </w:tcPr>
           <w:p>
             <w:r>
@@ -150,989 +237,3089 @@
         </w:tc>
         <w:tc>
           <w:tcPr>
-            <w:tcW w:type="dxa" w:w="2340"/>
+            <w:tcW w:type="dxa" w:w="2484"/>
+            <w:shd w:fill="FFFFFF"/>
+            <w:tcMar>
+              <w:top w:w="100" w:type="dxa"/>
+              <w:bottom w:w="100" w:type="dxa"/>
+              <w:left w:w="150" w:type="dxa"/>
+              <w:right w:w="150" w:type="dxa"/>
+            </w:tcMar>
           </w:tcPr>
           <w:p>
-            <w:r>
-              <w:t>https://www.youtube.com/watch?v=R9K15D5S-Z4</w:t>
-            </w:r>
+            <w:hyperlink r:id="rId9">
+              <w:r>
+                <w:rPr>
+                  <w:rColor w:val="0056B3"/>
+                  <w:u w:val="single"/>
+                </w:rPr>
+                <w:t>Listen / Watch</w:t>
+              </w:r>
+            </w:hyperlink>
           </w:p>
         </w:tc>
       </w:tr>
       <w:tr>
         <w:tc>
           <w:tcPr>
-            <w:tcW w:type="dxa" w:w="2340"/>
-            <w:shd w:fill="F3F4F6"/>
+            <w:tcW w:type="dxa" w:w="2484"/>
+            <w:shd w:fill="F8FAFC"/>
+            <w:tcMar>
+              <w:top w:w="100" w:type="dxa"/>
+              <w:bottom w:w="100" w:type="dxa"/>
+              <w:left w:w="150" w:type="dxa"/>
+              <w:right w:w="150" w:type="dxa"/>
+            </w:tcMar>
           </w:tcPr>
           <w:p>
+            <w:pPr>
+              <w:jc w:val="center"/>
+            </w:pPr>
             <w:r>
+              <w:rPr>
+                <w:b/>
+              </w:rPr>
               <w:t>2</w:t>
             </w:r>
           </w:p>
         </w:tc>
         <w:tc>
           <w:tcPr>
-            <w:tcW w:type="dxa" w:w="2340"/>
-            <w:shd w:fill="F3F4F6"/>
+            <w:tcW w:type="dxa" w:w="2484"/>
+            <w:shd w:fill="F8FAFC"/>
+            <w:tcMar>
+              <w:top w:w="100" w:type="dxa"/>
+              <w:bottom w:w="100" w:type="dxa"/>
+              <w:left w:w="150" w:type="dxa"/>
+              <w:right w:w="150" w:type="dxa"/>
+            </w:tcMar>
           </w:tcPr>
           <w:p>
             <w:r>
-              <w:t>Gratitude</w:t>
+              <w:rPr>
+                <w:b/>
+              </w:rPr>
+              <w:t>Holy Forever</w:t>
             </w:r>
           </w:p>
         </w:tc>
         <w:tc>
           <w:tcPr>
-            <w:tcW w:type="dxa" w:w="2340"/>
-            <w:shd w:fill="F3F4F6"/>
+            <w:tcW w:type="dxa" w:w="2484"/>
+            <w:shd w:fill="F8FAFC"/>
+            <w:tcMar>
+              <w:top w:w="100" w:type="dxa"/>
+              <w:bottom w:w="100" w:type="dxa"/>
+              <w:left w:w="150" w:type="dxa"/>
+              <w:right w:w="150" w:type="dxa"/>
+            </w:tcMar>
           </w:tcPr>
           <w:p>
             <w:r>
-              <w:t>Brandon Lake</w:t>
+              <w:t>CeCe Winans</w:t>
             </w:r>
           </w:p>
         </w:tc>
         <w:tc>
           <w:tcPr>
-            <w:tcW w:type="dxa" w:w="2340"/>
-            <w:shd w:fill="F3F4F6"/>
+            <w:tcW w:type="dxa" w:w="2484"/>
+            <w:shd w:fill="F8FAFC"/>
+            <w:tcMar>
+              <w:top w:w="100" w:type="dxa"/>
+              <w:bottom w:w="100" w:type="dxa"/>
+              <w:left w:w="150" w:type="dxa"/>
+              <w:right w:w="150" w:type="dxa"/>
+            </w:tcMar>
           </w:tcPr>
           <w:p>
-            <w:r>
-              <w:t>https://www.youtube.com/watch?v=R5H1t4D7k4g</w:t>
-            </w:r>
+            <w:hyperlink r:id="rId10">
+              <w:r>
+                <w:rPr>
+                  <w:rColor w:val="0056B3"/>
+                  <w:u w:val="single"/>
+                </w:rPr>
+                <w:t>Listen / Watch</w:t>
+              </w:r>
+            </w:hyperlink>
           </w:p>
         </w:tc>
       </w:tr>
       <w:tr>
         <w:tc>
           <w:tcPr>
-            <w:tcW w:type="dxa" w:w="2340"/>
+            <w:tcW w:type="dxa" w:w="2484"/>
+            <w:shd w:fill="FFFFFF"/>
+            <w:tcMar>
+              <w:top w:w="100" w:type="dxa"/>
+              <w:bottom w:w="100" w:type="dxa"/>
+              <w:left w:w="150" w:type="dxa"/>
+              <w:right w:w="150" w:type="dxa"/>
+            </w:tcMar>
           </w:tcPr>
           <w:p>
+            <w:pPr>
+              <w:jc w:val="center"/>
+            </w:pPr>
             <w:r>
+              <w:rPr>
+                <w:b/>
+              </w:rPr>
               <w:t>3</w:t>
             </w:r>
           </w:p>
         </w:tc>
         <w:tc>
           <w:tcPr>
-            <w:tcW w:type="dxa" w:w="2340"/>
+            <w:tcW w:type="dxa" w:w="2484"/>
+            <w:shd w:fill="FFFFFF"/>
+            <w:tcMar>
+              <w:top w:w="100" w:type="dxa"/>
+              <w:bottom w:w="100" w:type="dxa"/>
+              <w:left w:w="150" w:type="dxa"/>
+              <w:right w:w="150" w:type="dxa"/>
+            </w:tcMar>
           </w:tcPr>
           <w:p>
             <w:r>
-              <w:t>Holy Forever</w:t>
+              <w:rPr>
+                <w:b/>
+              </w:rPr>
+              <w:t>Trust In God</w:t>
             </w:r>
           </w:p>
         </w:tc>
         <w:tc>
           <w:tcPr>
-            <w:tcW w:type="dxa" w:w="2340"/>
+            <w:tcW w:type="dxa" w:w="2484"/>
+            <w:shd w:fill="FFFFFF"/>
+            <w:tcMar>
+              <w:top w:w="100" w:type="dxa"/>
+              <w:bottom w:w="100" w:type="dxa"/>
+              <w:left w:w="150" w:type="dxa"/>
+              <w:right w:w="150" w:type="dxa"/>
+            </w:tcMar>
           </w:tcPr>
           <w:p>
             <w:r>
-              <w:t>Chris Tomlin</w:t>
+              <w:t>Elevation Worship (feat. Chris Brown)</w:t>
             </w:r>
           </w:p>
         </w:tc>
         <w:tc>
           <w:tcPr>
-            <w:tcW w:type="dxa" w:w="2340"/>
+            <w:tcW w:type="dxa" w:w="2484"/>
+            <w:shd w:fill="FFFFFF"/>
+            <w:tcMar>
+              <w:top w:w="100" w:type="dxa"/>
+              <w:bottom w:w="100" w:type="dxa"/>
+              <w:left w:w="150" w:type="dxa"/>
+              <w:right w:w="150" w:type="dxa"/>
+            </w:tcMar>
           </w:tcPr>
           <w:p>
-            <w:r>
-              <w:t>https://www.youtube.com/watch?v=53zW335tD5g</w:t>
-            </w:r>
+            <w:hyperlink r:id="rId11">
+              <w:r>
+                <w:rPr>
+                  <w:rColor w:val="0056B3"/>
+                  <w:u w:val="single"/>
+                </w:rPr>
+                <w:t>Listen / Watch</w:t>
+              </w:r>
+            </w:hyperlink>
           </w:p>
         </w:tc>
       </w:tr>
       <w:tr>
         <w:tc>
           <w:tcPr>
-            <w:tcW w:type="dxa" w:w="2340"/>
-            <w:shd w:fill="F3F4F6"/>
+            <w:tcW w:type="dxa" w:w="2484"/>
+            <w:shd w:fill="F8FAFC"/>
+            <w:tcMar>
+              <w:top w:w="100" w:type="dxa"/>
+              <w:bottom w:w="100" w:type="dxa"/>
+              <w:left w:w="150" w:type="dxa"/>
+              <w:right w:w="150" w:type="dxa"/>
+            </w:tcMar>
           </w:tcPr>
           <w:p>
+            <w:pPr>
+              <w:jc w:val="center"/>
+            </w:pPr>
             <w:r>
+              <w:rPr>
+                <w:b/>
+              </w:rPr>
               <w:t>4</w:t>
             </w:r>
           </w:p>
         </w:tc>
         <w:tc>
           <w:tcPr>
-            <w:tcW w:type="dxa" w:w="2340"/>
-            <w:shd w:fill="F3F4F6"/>
+            <w:tcW w:type="dxa" w:w="2484"/>
+            <w:shd w:fill="F8FAFC"/>
+            <w:tcMar>
+              <w:top w:w="100" w:type="dxa"/>
+              <w:bottom w:w="100" w:type="dxa"/>
+              <w:left w:w="150" w:type="dxa"/>
+              <w:right w:w="150" w:type="dxa"/>
+            </w:tcMar>
           </w:tcPr>
           <w:p>
             <w:r>
-              <w:t>Firm Foundation (He Won't)</w:t>
+              <w:rPr>
+                <w:b/>
+              </w:rPr>
+              <w:t>Church</w:t>
             </w:r>
           </w:p>
         </w:tc>
         <w:tc>
           <w:tcPr>
-            <w:tcW w:type="dxa" w:w="2340"/>
-            <w:shd w:fill="F3F4F6"/>
+            <w:tcW w:type="dxa" w:w="2484"/>
+            <w:shd w:fill="F8FAFC"/>
+            <w:tcMar>
+              <w:top w:w="100" w:type="dxa"/>
+              <w:bottom w:w="100" w:type="dxa"/>
+              <w:left w:w="150" w:type="dxa"/>
+              <w:right w:w="150" w:type="dxa"/>
+            </w:tcMar>
           </w:tcPr>
           <w:p>
             <w:r>
-              <w:t>Cody Carnes</w:t>
+              <w:t>Tasha Cobbs Leonard (feat. John Legend)</w:t>
             </w:r>
           </w:p>
         </w:tc>
         <w:tc>
           <w:tcPr>
-            <w:tcW w:type="dxa" w:w="2340"/>
-            <w:shd w:fill="F3F4F6"/>
+            <w:tcW w:type="dxa" w:w="2484"/>
+            <w:shd w:fill="F8FAFC"/>
+            <w:tcMar>
+              <w:top w:w="100" w:type="dxa"/>
+              <w:bottom w:w="100" w:type="dxa"/>
+              <w:left w:w="150" w:type="dxa"/>
+              <w:right w:w="150" w:type="dxa"/>
+            </w:tcMar>
           </w:tcPr>
           <w:p>
-            <w:r>
-              <w:t>https://www.youtube.com/watch?v=gTj7Ue6r2gQ</w:t>
-            </w:r>
+            <w:hyperlink r:id="rId12">
+              <w:r>
+                <w:rPr>
+                  <w:rColor w:val="0056B3"/>
+                  <w:u w:val="single"/>
+                </w:rPr>
+                <w:t>Listen / Watch</w:t>
+              </w:r>
+            </w:hyperlink>
           </w:p>
         </w:tc>
       </w:tr>
       <w:tr>
         <w:tc>
           <w:tcPr>
-            <w:tcW w:type="dxa" w:w="2340"/>
+            <w:tcW w:type="dxa" w:w="2484"/>
+            <w:shd w:fill="FFFFFF"/>
+            <w:tcMar>
+              <w:top w:w="100" w:type="dxa"/>
+              <w:bottom w:w="100" w:type="dxa"/>
+              <w:left w:w="150" w:type="dxa"/>
+              <w:right w:w="150" w:type="dxa"/>
+            </w:tcMar>
           </w:tcPr>
           <w:p>
+            <w:pPr>
+              <w:jc w:val="center"/>
+            </w:pPr>
             <w:r>
+              <w:rPr>
+                <w:b/>
+              </w:rPr>
               <w:t>5</w:t>
             </w:r>
           </w:p>
         </w:tc>
         <w:tc>
           <w:tcPr>
-            <w:tcW w:type="dxa" w:w="2340"/>
+            <w:tcW w:type="dxa" w:w="2484"/>
+            <w:shd w:fill="FFFFFF"/>
+            <w:tcMar>
+              <w:top w:w="100" w:type="dxa"/>
+              <w:bottom w:w="100" w:type="dxa"/>
+              <w:left w:w="150" w:type="dxa"/>
+              <w:right w:w="150" w:type="dxa"/>
+            </w:tcMar>
           </w:tcPr>
           <w:p>
             <w:r>
-              <w:t>Jireh</w:t>
+              <w:rPr>
+                <w:b/>
+              </w:rPr>
+              <w:t>Come Jesus Come</w:t>
             </w:r>
           </w:p>
         </w:tc>
         <w:tc>
           <w:tcPr>
-            <w:tcW w:type="dxa" w:w="2340"/>
+            <w:tcW w:type="dxa" w:w="2484"/>
+            <w:shd w:fill="FFFFFF"/>
+            <w:tcMar>
+              <w:top w:w="100" w:type="dxa"/>
+              <w:bottom w:w="100" w:type="dxa"/>
+              <w:left w:w="150" w:type="dxa"/>
+              <w:right w:w="150" w:type="dxa"/>
+            </w:tcMar>
           </w:tcPr>
           <w:p>
             <w:r>
-              <w:t>Elevation Worship &amp; Maverick City Music</w:t>
+              <w:t>CeCe Winans / Stephen McWhirter</w:t>
             </w:r>
           </w:p>
         </w:tc>
         <w:tc>
           <w:tcPr>
-            <w:tcW w:type="dxa" w:w="2340"/>
+            <w:tcW w:type="dxa" w:w="2484"/>
+            <w:shd w:fill="FFFFFF"/>
+            <w:tcMar>
+              <w:top w:w="100" w:type="dxa"/>
+              <w:bottom w:w="100" w:type="dxa"/>
+              <w:left w:w="150" w:type="dxa"/>
+              <w:right w:w="150" w:type="dxa"/>
+            </w:tcMar>
+          </w:tcPr>
+          <w:p>
+            <w:hyperlink r:id="rId13">
+              <w:r>
+                <w:rPr>
+                  <w:rColor w:val="0056B3"/>
+                  <w:u w:val="single"/>
+                </w:rPr>
+                <w:t>Listen / Watch</w:t>
+              </w:r>
+            </w:hyperlink>
+          </w:p>
+        </w:tc>
+      </w:tr>
+      <w:tr>
+        <w:tc>
+          <w:tcPr>
+            <w:tcW w:type="dxa" w:w="2484"/>
+            <w:shd w:fill="F8FAFC"/>
+            <w:tcMar>
+              <w:top w:w="100" w:type="dxa"/>
+              <w:bottom w:w="100" w:type="dxa"/>
+              <w:left w:w="150" w:type="dxa"/>
+              <w:right w:w="150" w:type="dxa"/>
+            </w:tcMar>
+          </w:tcPr>
+          <w:p>
+            <w:pPr>
+              <w:jc w:val="center"/>
+            </w:pPr>
+            <w:r>
+              <w:rPr>
+                <w:b/>
+              </w:rPr>
+              <w:t>6</w:t>
+            </w:r>
+          </w:p>
+        </w:tc>
+        <w:tc>
+          <w:tcPr>
+            <w:tcW w:type="dxa" w:w="2484"/>
+            <w:shd w:fill="F8FAFC"/>
+            <w:tcMar>
+              <w:top w:w="100" w:type="dxa"/>
+              <w:bottom w:w="100" w:type="dxa"/>
+              <w:left w:w="150" w:type="dxa"/>
+              <w:right w:w="150" w:type="dxa"/>
+            </w:tcMar>
           </w:tcPr>
           <w:p>
             <w:r>
-              <w:t>https://www.youtube.com/watch?v=1V_xRb0x94I</w:t>
+              <w:rPr>
+                <w:b/>
+              </w:rPr>
+              <w:t>God Will Work It Out</w:t>
             </w:r>
+          </w:p>
+        </w:tc>
+        <w:tc>
+          <w:tcPr>
+            <w:tcW w:type="dxa" w:w="2484"/>
+            <w:shd w:fill="F8FAFC"/>
+            <w:tcMar>
+              <w:top w:w="100" w:type="dxa"/>
+              <w:bottom w:w="100" w:type="dxa"/>
+              <w:left w:w="150" w:type="dxa"/>
+              <w:right w:w="150" w:type="dxa"/>
+            </w:tcMar>
+          </w:tcPr>
+          <w:p>
+            <w:r>
+              <w:t>Naomi Raine</w:t>
+            </w:r>
+          </w:p>
+        </w:tc>
+        <w:tc>
+          <w:tcPr>
+            <w:tcW w:type="dxa" w:w="2484"/>
+            <w:shd w:fill="F8FAFC"/>
+            <w:tcMar>
+              <w:top w:w="100" w:type="dxa"/>
+              <w:bottom w:w="100" w:type="dxa"/>
+              <w:left w:w="150" w:type="dxa"/>
+              <w:right w:w="150" w:type="dxa"/>
+            </w:tcMar>
+          </w:tcPr>
+          <w:p>
+            <w:hyperlink r:id="rId14">
+              <w:r>
+                <w:rPr>
+                  <w:rColor w:val="0056B3"/>
+                  <w:u w:val="single"/>
+                </w:rPr>
+                <w:t>Listen / Watch</w:t>
+              </w:r>
+            </w:hyperlink>
           </w:p>
         </w:tc>
       </w:tr>
     </w:tbl>
-    <w:p/>
+    <w:p>
+      <w:r>
+        <w:br w:type="page"/>
+      </w:r>
+    </w:p>
     <w:p>
       <w:pPr>
-        <w:pStyle w:val="Heading2"/>
+        <w:spacing w:before="240" w:after="80"/>
       </w:pPr>
       <w:r>
         <w:rPr>
-          <w:color w:val="1E3A8A"/>
+          <w:rFonts w:ascii="Georgia" w:hAnsi="Georgia"/>
+          <w:b/>
+          <w:color w:val="1B365D"/>
+          <w:sz w:val="40"/>
         </w:rPr>
         <w:t>#1. Goodness of God</w:t>
       </w:r>
     </w:p>
     <w:p>
+      <w:pPr>
+        <w:spacing w:after="160"/>
+      </w:pPr>
       <w:r>
         <w:rPr>
           <w:b/>
+          <w:color w:val="4A5568"/>
+          <w:sz w:val="24"/>
         </w:rPr>
-        <w:t xml:space="preserve">Artist: </w:t>
+        <w:t>Performed by CeCe Winans</w:t>
       </w:r>
+    </w:p>
+    <w:tbl>
+      <w:tblPr>
+        <w:tblW w:type="auto" w:w="0"/>
+        <w:jc w:val="center"/>
+        <w:tblLook w:firstColumn="1" w:firstRow="1" w:lastColumn="0" w:lastRow="0" w:noHBand="0" w:noVBand="1" w:val="04A0"/>
+      </w:tblPr>
+      <w:tblGrid>
+        <w:gridCol w:w="9936"/>
+      </w:tblGrid>
+      <w:tr>
+        <w:tc>
+          <w:tcPr>
+            <w:tcW w:type="dxa" w:w="9792"/>
+            <w:shd w:fill="F0F4F8"/>
+            <w:tcMar>
+              <w:top w:w="140" w:type="dxa"/>
+              <w:bottom w:w="140" w:type="dxa"/>
+              <w:left w:w="180" w:type="dxa"/>
+              <w:right w:w="180" w:type="dxa"/>
+            </w:tcMar>
+          </w:tcPr>
+          <w:p>
+            <w:r>
+              <w:t xml:space="preserve">🔗 Official Link: </w:t>
+            </w:r>
+            <w:hyperlink r:id="rId9">
+              <w:r>
+                <w:rPr>
+                  <w:rColor w:val="0056B3"/>
+                  <w:u w:val="single"/>
+                </w:rPr>
+                <w:t>Watch Official Lyric Video on YouTube</w:t>
+              </w:r>
+            </w:hyperlink>
+          </w:p>
+        </w:tc>
+      </w:tr>
+    </w:tbl>
+    <w:p>
+      <w:pPr>
+        <w:spacing w:before="360" w:after="200"/>
+      </w:pPr>
       <w:r>
-        <w:t>CeCe Winans</w:t>
+        <w:rPr>
+          <w:rFonts w:ascii="Georgia" w:hAnsi="Georgia"/>
+          <w:b/>
+          <w:color w:val="2B4C7E"/>
+          <w:sz w:val="28"/>
+        </w:rPr>
+        <w:t>Lyrics</w:t>
+      </w:r>
+    </w:p>
+    <w:p>
+      <w:pPr>
+        <w:spacing w:after="200" w:line="276" w:lineRule="auto"/>
+      </w:pPr>
+      <w:r>
+        <w:rPr>
+          <w:rFonts w:ascii="Calibri" w:hAnsi="Calibri"/>
+          <w:sz w:val="22"/>
+        </w:rPr>
+        <w:t>I love You, Lord, oh Your mercy never fails me</w:t>
         <w:br/>
       </w:r>
       <w:r>
         <w:rPr>
-          <w:b/>
+          <w:rFonts w:ascii="Calibri" w:hAnsi="Calibri"/>
+          <w:sz w:val="22"/>
         </w:rPr>
-        <w:t xml:space="preserve">Official Link: </w:t>
+        <w:t>All my days I've been held in Your hands</w:t>
+        <w:br/>
       </w:r>
       <w:r>
         <w:rPr>
-          <w:color w:val="2563EB"/>
-          <w:u w:val="single"/>
+          <w:rFonts w:ascii="Calibri" w:hAnsi="Calibri"/>
+          <w:sz w:val="22"/>
         </w:rPr>
-        <w:t>https://www.youtube.com/watch?v=R9K15D5S-Z4</w:t>
+        <w:t>From the moment that I wake up</w:t>
+        <w:br/>
+      </w:r>
+      <w:r>
+        <w:rPr>
+          <w:rFonts w:ascii="Calibri" w:hAnsi="Calibri"/>
+          <w:sz w:val="22"/>
+        </w:rPr>
+        <w:t>Until I lay my head</w:t>
+        <w:br/>
+      </w:r>
+      <w:r>
+        <w:rPr>
+          <w:rFonts w:ascii="Calibri" w:hAnsi="Calibri"/>
+          <w:sz w:val="22"/>
+        </w:rPr>
+        <w:t>Oh, I will sing of the goodness of God</w:t>
+        <w:br/>
+      </w:r>
+    </w:p>
+    <w:p>
+      <w:pPr>
+        <w:spacing w:before="160" w:after="40"/>
+      </w:pPr>
+      <w:r>
+        <w:rPr>
+          <w:b/>
+          <w:color w:val="718096"/>
+          <w:sz w:val="20"/>
+        </w:rPr>
+        <w:t>[Verse 1]</w:t>
+      </w:r>
+    </w:p>
+    <w:p>
+      <w:pPr>
+        <w:spacing w:after="200" w:line="276" w:lineRule="auto"/>
+      </w:pPr>
+      <w:r>
+        <w:rPr>
+          <w:rFonts w:ascii="Calibri" w:hAnsi="Calibri"/>
+          <w:sz w:val="22"/>
+        </w:rPr>
+        <w:t>'Cause all my life You have been faithful</w:t>
+        <w:br/>
+      </w:r>
+      <w:r>
+        <w:rPr>
+          <w:rFonts w:ascii="Calibri" w:hAnsi="Calibri"/>
+          <w:sz w:val="22"/>
+        </w:rPr>
+        <w:t>And all my life You have been so, so good</w:t>
+        <w:br/>
+      </w:r>
+      <w:r>
+        <w:rPr>
+          <w:rFonts w:ascii="Calibri" w:hAnsi="Calibri"/>
+          <w:sz w:val="22"/>
+        </w:rPr>
+        <w:t>With every breath that I am able</w:t>
+        <w:br/>
+      </w:r>
+      <w:r>
+        <w:rPr>
+          <w:rFonts w:ascii="Calibri" w:hAnsi="Calibri"/>
+          <w:sz w:val="22"/>
+        </w:rPr>
+        <w:t>Oh, I will sing of the goodness of God</w:t>
+        <w:br/>
+      </w:r>
+    </w:p>
+    <w:p>
+      <w:pPr>
+        <w:spacing w:before="160" w:after="40"/>
+      </w:pPr>
+      <w:r>
+        <w:rPr>
+          <w:b/>
+          <w:color w:val="718096"/>
+          <w:sz w:val="20"/>
+        </w:rPr>
+        <w:t>[Chorus]</w:t>
+      </w:r>
+    </w:p>
+    <w:p>
+      <w:pPr>
+        <w:spacing w:after="200" w:line="276" w:lineRule="auto"/>
+      </w:pPr>
+      <w:r>
+        <w:rPr>
+          <w:rFonts w:ascii="Calibri" w:hAnsi="Calibri"/>
+          <w:sz w:val="22"/>
+        </w:rPr>
+        <w:t>I love Your voice</w:t>
+        <w:br/>
+      </w:r>
+      <w:r>
+        <w:rPr>
+          <w:rFonts w:ascii="Calibri" w:hAnsi="Calibri"/>
+          <w:sz w:val="22"/>
+        </w:rPr>
+        <w:t>You have led me through the fire</w:t>
+        <w:br/>
+      </w:r>
+      <w:r>
+        <w:rPr>
+          <w:rFonts w:ascii="Calibri" w:hAnsi="Calibri"/>
+          <w:sz w:val="22"/>
+        </w:rPr>
+        <w:t>In darkest night You are close like no other</w:t>
+        <w:br/>
+      </w:r>
+      <w:r>
+        <w:rPr>
+          <w:rFonts w:ascii="Calibri" w:hAnsi="Calibri"/>
+          <w:sz w:val="22"/>
+        </w:rPr>
+        <w:t>I've known You as a Father</w:t>
+        <w:br/>
+      </w:r>
+      <w:r>
+        <w:rPr>
+          <w:rFonts w:ascii="Calibri" w:hAnsi="Calibri"/>
+          <w:sz w:val="22"/>
+        </w:rPr>
+        <w:t>I've known You as a Friend</w:t>
+        <w:br/>
+      </w:r>
+      <w:r>
+        <w:rPr>
+          <w:rFonts w:ascii="Calibri" w:hAnsi="Calibri"/>
+          <w:sz w:val="22"/>
+        </w:rPr>
+        <w:t>And I have lived in the goodness of God</w:t>
+        <w:br/>
+      </w:r>
+    </w:p>
+    <w:p>
+      <w:pPr>
+        <w:spacing w:before="160" w:after="40"/>
+      </w:pPr>
+      <w:r>
+        <w:rPr>
+          <w:b/>
+          <w:color w:val="718096"/>
+          <w:sz w:val="20"/>
+        </w:rPr>
+        <w:t>[Verse 2]</w:t>
+      </w:r>
+    </w:p>
+    <w:p>
+      <w:pPr>
+        <w:spacing w:after="200" w:line="276" w:lineRule="auto"/>
+      </w:pPr>
+      <w:r>
+        <w:rPr>
+          <w:rFonts w:ascii="Calibri" w:hAnsi="Calibri"/>
+          <w:sz w:val="22"/>
+        </w:rPr>
+        <w:t>'Cause all my life You have been faithful</w:t>
+        <w:br/>
+      </w:r>
+      <w:r>
+        <w:rPr>
+          <w:rFonts w:ascii="Calibri" w:hAnsi="Calibri"/>
+          <w:sz w:val="22"/>
+        </w:rPr>
+        <w:t>And all my life You have been so, so good</w:t>
+        <w:br/>
+      </w:r>
+      <w:r>
+        <w:rPr>
+          <w:rFonts w:ascii="Calibri" w:hAnsi="Calibri"/>
+          <w:sz w:val="22"/>
+        </w:rPr>
+        <w:t>With every breath that I am able</w:t>
+        <w:br/>
+      </w:r>
+      <w:r>
+        <w:rPr>
+          <w:rFonts w:ascii="Calibri" w:hAnsi="Calibri"/>
+          <w:sz w:val="22"/>
+        </w:rPr>
+        <w:t>Oh, I will sing of the goodness of God</w:t>
+        <w:br/>
+      </w:r>
+    </w:p>
+    <w:p>
+      <w:pPr>
+        <w:spacing w:before="160" w:after="40"/>
+      </w:pPr>
+      <w:r>
+        <w:rPr>
+          <w:b/>
+          <w:color w:val="718096"/>
+          <w:sz w:val="20"/>
+        </w:rPr>
+        <w:t>[Chorus]</w:t>
+      </w:r>
+    </w:p>
+    <w:p>
+      <w:pPr>
+        <w:spacing w:after="200" w:line="276" w:lineRule="auto"/>
+      </w:pPr>
+      <w:r>
+        <w:rPr>
+          <w:rFonts w:ascii="Calibri" w:hAnsi="Calibri"/>
+          <w:sz w:val="22"/>
+        </w:rPr>
+        <w:t>Your goodness is running after, it's running after me</w:t>
+        <w:br/>
+      </w:r>
+      <w:r>
+        <w:rPr>
+          <w:rFonts w:ascii="Calibri" w:hAnsi="Calibri"/>
+          <w:sz w:val="22"/>
+        </w:rPr>
+        <w:t>Your goodness is running after, it's running after me</w:t>
+        <w:br/>
+      </w:r>
+      <w:r>
+        <w:rPr>
+          <w:rFonts w:ascii="Calibri" w:hAnsi="Calibri"/>
+          <w:sz w:val="22"/>
+        </w:rPr>
+        <w:t>With my life laid down, I'm surrendered now, I give You everything</w:t>
+        <w:br/>
+      </w:r>
+      <w:r>
+        <w:rPr>
+          <w:rFonts w:ascii="Calibri" w:hAnsi="Calibri"/>
+          <w:sz w:val="22"/>
+        </w:rPr>
+        <w:t>Your goodness is running after, it's running after me</w:t>
+        <w:br/>
+      </w:r>
+    </w:p>
+    <w:p>
+      <w:pPr>
+        <w:spacing w:before="160" w:after="40"/>
+      </w:pPr>
+      <w:r>
+        <w:rPr>
+          <w:b/>
+          <w:color w:val="718096"/>
+          <w:sz w:val="20"/>
+        </w:rPr>
+        <w:t>[Bridge]</w:t>
+      </w:r>
+    </w:p>
+    <w:p>
+      <w:pPr>
+        <w:spacing w:after="200" w:line="276" w:lineRule="auto"/>
+      </w:pPr>
+      <w:r>
+        <w:rPr>
+          <w:rFonts w:ascii="Calibri" w:hAnsi="Calibri"/>
+          <w:sz w:val="22"/>
+        </w:rPr>
+        <w:t>'Cause all my life You have been faithful</w:t>
+        <w:br/>
+      </w:r>
+      <w:r>
+        <w:rPr>
+          <w:rFonts w:ascii="Calibri" w:hAnsi="Calibri"/>
+          <w:sz w:val="22"/>
+        </w:rPr>
+        <w:t>And all my life You have been so, so good</w:t>
+        <w:br/>
+      </w:r>
+      <w:r>
+        <w:rPr>
+          <w:rFonts w:ascii="Calibri" w:hAnsi="Calibri"/>
+          <w:sz w:val="22"/>
+        </w:rPr>
+        <w:t>With every breath that I am able</w:t>
+        <w:br/>
+      </w:r>
+      <w:r>
+        <w:rPr>
+          <w:rFonts w:ascii="Calibri" w:hAnsi="Calibri"/>
+          <w:sz w:val="22"/>
+        </w:rPr>
+        <w:t>Oh, I will sing of the goodness of God</w:t>
+        <w:br/>
+      </w:r>
+    </w:p>
+    <w:p>
+      <w:pPr>
+        <w:spacing w:before="160" w:after="40"/>
+      </w:pPr>
+      <w:r>
+        <w:rPr>
+          <w:b/>
+          <w:color w:val="718096"/>
+          <w:sz w:val="20"/>
+        </w:rPr>
+        <w:t>[Chorus]</w:t>
+      </w:r>
+    </w:p>
+    <w:p>
+      <w:pPr>
+        <w:spacing w:after="200" w:line="276" w:lineRule="auto"/>
+      </w:pPr>
+      <w:r>
+        <w:rPr>
+          <w:rFonts w:ascii="Calibri" w:hAnsi="Calibri"/>
+          <w:sz w:val="22"/>
+        </w:rPr>
+        <w:t>Oh, I will sing of the goodness of God</w:t>
+        <w:br/>
+      </w:r>
+    </w:p>
+    <w:p>
+      <w:pPr>
+        <w:spacing w:before="160" w:after="40"/>
+      </w:pPr>
+      <w:r>
+        <w:rPr>
+          <w:b/>
+          <w:color w:val="718096"/>
+          <w:sz w:val="20"/>
+        </w:rPr>
+        <w:t>[Outro]</w:t>
       </w:r>
     </w:p>
     <w:p>
       <w:r>
+        <w:br w:type="page"/>
+      </w:r>
+    </w:p>
+    <w:p>
+      <w:pPr>
+        <w:spacing w:before="240" w:after="80"/>
+      </w:pPr>
+      <w:r>
+        <w:rPr>
+          <w:rFonts w:ascii="Georgia" w:hAnsi="Georgia"/>
+          <w:b/>
+          <w:color w:val="1B365D"/>
+          <w:sz w:val="40"/>
+        </w:rPr>
+        <w:t>#2. Holy Forever</w:t>
+      </w:r>
+    </w:p>
+    <w:p>
+      <w:pPr>
+        <w:spacing w:after="160"/>
+      </w:pPr>
+      <w:r>
         <w:rPr>
           <w:b/>
-          <w:color w:val="374151"/>
+          <w:color w:val="4A5568"/>
+          <w:sz w:val="24"/>
         </w:rPr>
-        <w:t>Lyrics:</w:t>
+        <w:t>Performed by CeCe Winans</w:t>
+      </w:r>
+    </w:p>
+    <w:tbl>
+      <w:tblPr>
+        <w:tblW w:type="auto" w:w="0"/>
+        <w:jc w:val="center"/>
+        <w:tblLook w:firstColumn="1" w:firstRow="1" w:lastColumn="0" w:lastRow="0" w:noHBand="0" w:noVBand="1" w:val="04A0"/>
+      </w:tblPr>
+      <w:tblGrid>
+        <w:gridCol w:w="9936"/>
+      </w:tblGrid>
+      <w:tr>
+        <w:tc>
+          <w:tcPr>
+            <w:tcW w:type="dxa" w:w="9792"/>
+            <w:shd w:fill="F0F4F8"/>
+            <w:tcMar>
+              <w:top w:w="140" w:type="dxa"/>
+              <w:bottom w:w="140" w:type="dxa"/>
+              <w:left w:w="180" w:type="dxa"/>
+              <w:right w:w="180" w:type="dxa"/>
+            </w:tcMar>
+          </w:tcPr>
+          <w:p>
+            <w:r>
+              <w:t xml:space="preserve">🔗 Official Link: </w:t>
+            </w:r>
+            <w:hyperlink r:id="rId10">
+              <w:r>
+                <w:rPr>
+                  <w:rColor w:val="0056B3"/>
+                  <w:u w:val="single"/>
+                </w:rPr>
+                <w:t>Watch Official Lyric Video on YouTube</w:t>
+              </w:r>
+            </w:hyperlink>
+          </w:p>
+        </w:tc>
+      </w:tr>
+    </w:tbl>
+    <w:p>
+      <w:pPr>
+        <w:spacing w:before="360" w:after="200"/>
+      </w:pPr>
+      <w:r>
+        <w:rPr>
+          <w:rFonts w:ascii="Georgia" w:hAnsi="Georgia"/>
+          <w:b/>
+          <w:color w:val="2B4C7E"/>
+          <w:sz w:val="28"/>
+        </w:rPr>
+        <w:t>Lyrics</w:t>
+      </w:r>
+    </w:p>
+    <w:p>
+      <w:pPr>
+        <w:spacing w:after="200" w:line="276" w:lineRule="auto"/>
+      </w:pPr>
+      <w:r>
+        <w:rPr>
+          <w:rFonts w:ascii="Calibri" w:hAnsi="Calibri"/>
+          <w:sz w:val="22"/>
+        </w:rPr>
+        <w:t>A thousand generations falling down in worship</w:t>
+        <w:br/>
+      </w:r>
+      <w:r>
+        <w:rPr>
+          <w:rFonts w:ascii="Calibri" w:hAnsi="Calibri"/>
+          <w:sz w:val="22"/>
+        </w:rPr>
+        <w:t>To sing the song of ages to the Lamb</w:t>
+        <w:br/>
+      </w:r>
+      <w:r>
+        <w:rPr>
+          <w:rFonts w:ascii="Calibri" w:hAnsi="Calibri"/>
+          <w:sz w:val="22"/>
+        </w:rPr>
+        <w:t>And all who've gone before us and all who will believe</w:t>
+        <w:br/>
+      </w:r>
+      <w:r>
+        <w:rPr>
+          <w:rFonts w:ascii="Calibri" w:hAnsi="Calibri"/>
+          <w:sz w:val="22"/>
+        </w:rPr>
+        <w:t>Will sing the song of ages to the Lamb</w:t>
+        <w:br/>
+      </w:r>
+    </w:p>
+    <w:p>
+      <w:pPr>
+        <w:spacing w:before="160" w:after="40"/>
+      </w:pPr>
+      <w:r>
+        <w:rPr>
+          <w:b/>
+          <w:color w:val="718096"/>
+          <w:sz w:val="20"/>
+        </w:rPr>
+        <w:t>[Verse 1]</w:t>
+      </w:r>
+    </w:p>
+    <w:p>
+      <w:pPr>
+        <w:spacing w:after="200" w:line="276" w:lineRule="auto"/>
+      </w:pPr>
+      <w:r>
+        <w:rPr>
+          <w:rFonts w:ascii="Calibri" w:hAnsi="Calibri"/>
+          <w:sz w:val="22"/>
+        </w:rPr>
+        <w:t>Your name is the highest</w:t>
+        <w:br/>
+      </w:r>
+      <w:r>
+        <w:rPr>
+          <w:rFonts w:ascii="Calibri" w:hAnsi="Calibri"/>
+          <w:sz w:val="22"/>
+        </w:rPr>
+        <w:t>Your name is the greatest</w:t>
+        <w:br/>
+      </w:r>
+      <w:r>
+        <w:rPr>
+          <w:rFonts w:ascii="Calibri" w:hAnsi="Calibri"/>
+          <w:sz w:val="22"/>
+        </w:rPr>
+        <w:t>Your name stands above them all</w:t>
+        <w:br/>
+      </w:r>
+      <w:r>
+        <w:rPr>
+          <w:rFonts w:ascii="Calibri" w:hAnsi="Calibri"/>
+          <w:sz w:val="22"/>
+        </w:rPr>
+        <w:t>All thrones and dominions</w:t>
+        <w:br/>
+      </w:r>
+      <w:r>
+        <w:rPr>
+          <w:rFonts w:ascii="Calibri" w:hAnsi="Calibri"/>
+          <w:sz w:val="22"/>
+        </w:rPr>
+        <w:t>All powers and positions</w:t>
+        <w:br/>
+      </w:r>
+      <w:r>
+        <w:rPr>
+          <w:rFonts w:ascii="Calibri" w:hAnsi="Calibri"/>
+          <w:sz w:val="22"/>
+        </w:rPr>
+        <w:t>Your name stands above them all</w:t>
+        <w:br/>
+      </w:r>
+    </w:p>
+    <w:p>
+      <w:pPr>
+        <w:spacing w:before="160" w:after="40"/>
+      </w:pPr>
+      <w:r>
+        <w:rPr>
+          <w:b/>
+          <w:color w:val="718096"/>
+          <w:sz w:val="20"/>
+        </w:rPr>
+        <w:t>[Pre-Chorus]</w:t>
+      </w:r>
+    </w:p>
+    <w:p>
+      <w:pPr>
+        <w:spacing w:after="200" w:line="276" w:lineRule="auto"/>
+      </w:pPr>
+      <w:r>
+        <w:rPr>
+          <w:rFonts w:ascii="Calibri" w:hAnsi="Calibri"/>
+          <w:sz w:val="22"/>
+        </w:rPr>
+        <w:t>And the angels cry, "Holy"</w:t>
+        <w:br/>
+      </w:r>
+      <w:r>
+        <w:rPr>
+          <w:rFonts w:ascii="Calibri" w:hAnsi="Calibri"/>
+          <w:sz w:val="22"/>
+        </w:rPr>
+        <w:t>All creation cries, "Holy"</w:t>
+        <w:br/>
+      </w:r>
+      <w:r>
+        <w:rPr>
+          <w:rFonts w:ascii="Calibri" w:hAnsi="Calibri"/>
+          <w:sz w:val="22"/>
+        </w:rPr>
+        <w:t>You are lifted high, holy</w:t>
+        <w:br/>
+      </w:r>
+      <w:r>
+        <w:rPr>
+          <w:rFonts w:ascii="Calibri" w:hAnsi="Calibri"/>
+          <w:sz w:val="22"/>
+        </w:rPr>
+        <w:t>Holy forever</w:t>
+        <w:br/>
+      </w:r>
+    </w:p>
+    <w:p>
+      <w:pPr>
+        <w:spacing w:before="160" w:after="40"/>
+      </w:pPr>
+      <w:r>
+        <w:rPr>
+          <w:b/>
+          <w:color w:val="718096"/>
+          <w:sz w:val="20"/>
+        </w:rPr>
+        <w:t>[Chorus]</w:t>
+      </w:r>
+    </w:p>
+    <w:p>
+      <w:pPr>
+        <w:spacing w:after="200" w:line="276" w:lineRule="auto"/>
+      </w:pPr>
+      <w:r>
+        <w:rPr>
+          <w:rFonts w:ascii="Calibri" w:hAnsi="Calibri"/>
+          <w:sz w:val="22"/>
+        </w:rPr>
+        <w:t>If you've been forgiven and if you've been redeemed</w:t>
+        <w:br/>
+      </w:r>
+      <w:r>
+        <w:rPr>
+          <w:rFonts w:ascii="Calibri" w:hAnsi="Calibri"/>
+          <w:sz w:val="22"/>
+        </w:rPr>
+        <w:t>Sing the song forever to the Lamb</w:t>
+        <w:br/>
+      </w:r>
+      <w:r>
+        <w:rPr>
+          <w:rFonts w:ascii="Calibri" w:hAnsi="Calibri"/>
+          <w:sz w:val="22"/>
+        </w:rPr>
+        <w:t>And if you walk in freedom and if you bear His name</w:t>
+        <w:br/>
+      </w:r>
+      <w:r>
+        <w:rPr>
+          <w:rFonts w:ascii="Calibri" w:hAnsi="Calibri"/>
+          <w:sz w:val="22"/>
+        </w:rPr>
+        <w:t>Sing the song forever to the Lamb</w:t>
+        <w:br/>
+      </w:r>
+      <w:r>
+        <w:rPr>
+          <w:rFonts w:ascii="Calibri" w:hAnsi="Calibri"/>
+          <w:sz w:val="22"/>
+        </w:rPr>
+        <w:t>We'll sing the song forever and amen</w:t>
+        <w:br/>
+      </w:r>
+    </w:p>
+    <w:p>
+      <w:pPr>
+        <w:spacing w:before="160" w:after="40"/>
+      </w:pPr>
+      <w:r>
+        <w:rPr>
+          <w:b/>
+          <w:color w:val="718096"/>
+          <w:sz w:val="20"/>
+        </w:rPr>
+        <w:t>[Verse 2]</w:t>
+      </w:r>
+    </w:p>
+    <w:p>
+      <w:pPr>
+        <w:spacing w:after="200" w:line="276" w:lineRule="auto"/>
+      </w:pPr>
+      <w:r>
+        <w:rPr>
+          <w:rFonts w:ascii="Calibri" w:hAnsi="Calibri"/>
+          <w:sz w:val="22"/>
+        </w:rPr>
+        <w:t>And the angels cry, "Holy"</w:t>
+        <w:br/>
+      </w:r>
+      <w:r>
+        <w:rPr>
+          <w:rFonts w:ascii="Calibri" w:hAnsi="Calibri"/>
+          <w:sz w:val="22"/>
+        </w:rPr>
+        <w:t>All creation cries, "Holy"</w:t>
+        <w:br/>
+      </w:r>
+      <w:r>
+        <w:rPr>
+          <w:rFonts w:ascii="Calibri" w:hAnsi="Calibri"/>
+          <w:sz w:val="22"/>
+        </w:rPr>
+        <w:t>You are lifted high, holy</w:t>
+        <w:br/>
+      </w:r>
+      <w:r>
+        <w:rPr>
+          <w:rFonts w:ascii="Calibri" w:hAnsi="Calibri"/>
+          <w:sz w:val="22"/>
+        </w:rPr>
+        <w:t>Holy forever</w:t>
+        <w:br/>
+      </w:r>
+      <w:r>
+        <w:rPr>
+          <w:rFonts w:ascii="Calibri" w:hAnsi="Calibri"/>
+          <w:sz w:val="22"/>
+        </w:rPr>
+        <w:t>Hear your people sing, "Holy"</w:t>
+        <w:br/>
+      </w:r>
+      <w:r>
+        <w:rPr>
+          <w:rFonts w:ascii="Calibri" w:hAnsi="Calibri"/>
+          <w:sz w:val="22"/>
+        </w:rPr>
+        <w:t>To the King of kings, holy</w:t>
+        <w:br/>
+      </w:r>
+      <w:r>
+        <w:rPr>
+          <w:rFonts w:ascii="Calibri" w:hAnsi="Calibri"/>
+          <w:sz w:val="22"/>
+        </w:rPr>
+        <w:t>You will always be, holy</w:t>
+        <w:br/>
+      </w:r>
+      <w:r>
+        <w:rPr>
+          <w:rFonts w:ascii="Calibri" w:hAnsi="Calibri"/>
+          <w:sz w:val="22"/>
+        </w:rPr>
+        <w:t>Holy forever</w:t>
+        <w:br/>
+      </w:r>
+    </w:p>
+    <w:p>
+      <w:pPr>
+        <w:spacing w:before="160" w:after="40"/>
+      </w:pPr>
+      <w:r>
+        <w:rPr>
+          <w:b/>
+          <w:color w:val="718096"/>
+          <w:sz w:val="20"/>
+        </w:rPr>
+        <w:t>[Chorus]</w:t>
+      </w:r>
+    </w:p>
+    <w:p>
+      <w:pPr>
+        <w:spacing w:after="200" w:line="276" w:lineRule="auto"/>
+      </w:pPr>
+      <w:r>
+        <w:rPr>
+          <w:rFonts w:ascii="Calibri" w:hAnsi="Calibri"/>
+          <w:sz w:val="22"/>
+        </w:rPr>
+        <w:t>Your name is the highest</w:t>
+        <w:br/>
+      </w:r>
+      <w:r>
+        <w:rPr>
+          <w:rFonts w:ascii="Calibri" w:hAnsi="Calibri"/>
+          <w:sz w:val="22"/>
+        </w:rPr>
+        <w:t>Your name is the greatest</w:t>
+        <w:br/>
+      </w:r>
+      <w:r>
+        <w:rPr>
+          <w:rFonts w:ascii="Calibri" w:hAnsi="Calibri"/>
+          <w:sz w:val="22"/>
+        </w:rPr>
+        <w:t>Your name stands above them all</w:t>
+        <w:br/>
+      </w:r>
+      <w:r>
+        <w:rPr>
+          <w:rFonts w:ascii="Calibri" w:hAnsi="Calibri"/>
+          <w:sz w:val="22"/>
+        </w:rPr>
+        <w:t>All thrones and dominions</w:t>
+        <w:br/>
+      </w:r>
+      <w:r>
+        <w:rPr>
+          <w:rFonts w:ascii="Calibri" w:hAnsi="Calibri"/>
+          <w:sz w:val="22"/>
+        </w:rPr>
+        <w:t>All powers and positions</w:t>
+        <w:br/>
+      </w:r>
+      <w:r>
+        <w:rPr>
+          <w:rFonts w:ascii="Calibri" w:hAnsi="Calibri"/>
+          <w:sz w:val="22"/>
+        </w:rPr>
+        <w:t>Your name stands above them all</w:t>
+        <w:br/>
+      </w:r>
+    </w:p>
+    <w:p>
+      <w:pPr>
+        <w:spacing w:before="160" w:after="40"/>
+      </w:pPr>
+      <w:r>
+        <w:rPr>
+          <w:b/>
+          <w:color w:val="718096"/>
+          <w:sz w:val="20"/>
+        </w:rPr>
+        <w:t>[Bridge]</w:t>
+      </w:r>
+    </w:p>
+    <w:p>
+      <w:pPr>
+        <w:spacing w:after="200" w:line="276" w:lineRule="auto"/>
+      </w:pPr>
+      <w:r>
+        <w:rPr>
+          <w:rFonts w:ascii="Calibri" w:hAnsi="Calibri"/>
+          <w:sz w:val="22"/>
+        </w:rPr>
+        <w:t>And the angels cry, "Holy"</w:t>
+        <w:br/>
+      </w:r>
+      <w:r>
+        <w:rPr>
+          <w:rFonts w:ascii="Calibri" w:hAnsi="Calibri"/>
+          <w:sz w:val="22"/>
+        </w:rPr>
+        <w:t>All creation cries, "Holy"</w:t>
+        <w:br/>
+      </w:r>
+      <w:r>
+        <w:rPr>
+          <w:rFonts w:ascii="Calibri" w:hAnsi="Calibri"/>
+          <w:sz w:val="22"/>
+        </w:rPr>
+        <w:t>You are lifted high, holy</w:t>
+        <w:br/>
+      </w:r>
+      <w:r>
+        <w:rPr>
+          <w:rFonts w:ascii="Calibri" w:hAnsi="Calibri"/>
+          <w:sz w:val="22"/>
+        </w:rPr>
+        <w:t>Holy forever</w:t>
+        <w:br/>
+      </w:r>
+      <w:r>
+        <w:rPr>
+          <w:rFonts w:ascii="Calibri" w:hAnsi="Calibri"/>
+          <w:sz w:val="22"/>
+        </w:rPr>
+        <w:t>Hear your people sing, "Holy"</w:t>
+        <w:br/>
+      </w:r>
+      <w:r>
+        <w:rPr>
+          <w:rFonts w:ascii="Calibri" w:hAnsi="Calibri"/>
+          <w:sz w:val="22"/>
+        </w:rPr>
+        <w:t>To the King of kings, holy</w:t>
+        <w:br/>
+      </w:r>
+      <w:r>
+        <w:rPr>
+          <w:rFonts w:ascii="Calibri" w:hAnsi="Calibri"/>
+          <w:sz w:val="22"/>
+        </w:rPr>
+        <w:t>You will always be, holy</w:t>
+        <w:br/>
+      </w:r>
+      <w:r>
+        <w:rPr>
+          <w:rFonts w:ascii="Calibri" w:hAnsi="Calibri"/>
+          <w:sz w:val="22"/>
+        </w:rPr>
+        <w:t>Holy forever</w:t>
+        <w:br/>
+      </w:r>
+      <w:r>
+        <w:rPr>
+          <w:rFonts w:ascii="Calibri" w:hAnsi="Calibri"/>
+          <w:sz w:val="22"/>
+        </w:rPr>
+        <w:t>You will always be, holy</w:t>
+        <w:br/>
+      </w:r>
+      <w:r>
+        <w:rPr>
+          <w:rFonts w:ascii="Calibri" w:hAnsi="Calibri"/>
+          <w:sz w:val="22"/>
+        </w:rPr>
+        <w:t>Holy forever</w:t>
+        <w:br/>
+      </w:r>
+    </w:p>
+    <w:p>
+      <w:pPr>
+        <w:spacing w:before="160" w:after="40"/>
+      </w:pPr>
+      <w:r>
+        <w:rPr>
+          <w:b/>
+          <w:color w:val="718096"/>
+          <w:sz w:val="20"/>
+        </w:rPr>
+        <w:t>[Chorus / Outro]</w:t>
       </w:r>
     </w:p>
     <w:p>
       <w:r>
-        <w:rPr>
-          <w:rFonts w:ascii="Georgia" w:hAnsi="Georgia"/>
-          <w:color w:val="1F2937"/>
-          <w:sz w:val="21"/>
-        </w:rPr>
-        <w:t>[Verse 1]</w:t>
-        <w:br/>
-        <w:t>I love You, Lord</w:t>
-        <w:br/>
-        <w:t>For Your mercy never fails me</w:t>
-        <w:br/>
-        <w:t>All my days, I've been held in Your hands</w:t>
-        <w:br/>
-        <w:t>From the moment that I wake up</w:t>
-        <w:br/>
-        <w:t>Until I lay my head</w:t>
-        <w:br/>
-        <w:t>Oh, I will sing of the goodness of God</w:t>
-        <w:br/>
-        <w:br/>
-        <w:t>[Chorus]</w:t>
-        <w:br/>
-        <w:t>'Cause all my life You have been faithful</w:t>
-        <w:br/>
-        <w:t>And all my life You have been so, so good</w:t>
-        <w:br/>
-        <w:t>With every breath that I am able</w:t>
-        <w:br/>
-        <w:t>Oh, I will sing of the goodness of God</w:t>
-        <w:br/>
-        <w:br/>
-        <w:t>[Verse 2]</w:t>
-        <w:br/>
-        <w:t>I love Your voice</w:t>
-        <w:br/>
-        <w:t>You have led me through the fire</w:t>
-        <w:br/>
-        <w:t>In darkest night You are close like no other</w:t>
-        <w:br/>
-        <w:t>I've known You as a Father</w:t>
-        <w:br/>
-        <w:t>I've known You as a Friend</w:t>
-        <w:br/>
-        <w:t>And I have lived in the goodness of God, yeah</w:t>
-        <w:br/>
-        <w:br/>
-        <w:t>[Chorus]</w:t>
-        <w:br/>
-        <w:t>'Cause all my life You have been faithful</w:t>
-        <w:br/>
-        <w:t>And all my life You have been so, so good</w:t>
-        <w:br/>
-        <w:t>With every breath that I am able</w:t>
-        <w:br/>
-        <w:t>Oh, I will sing of the goodness of God</w:t>
-        <w:br/>
-        <w:br/>
-        <w:t>[Bridge]</w:t>
-        <w:br/>
-        <w:t>Your goodness is running after, it's running after me</w:t>
-        <w:br/>
-        <w:t>Your goodness is running after, it's running after me</w:t>
-        <w:br/>
-        <w:t>With my life laid down, I'm surrendered now</w:t>
-        <w:br/>
-        <w:t>I give You everything</w:t>
-        <w:br/>
-        <w:t>Your goodness is running after, it's running after me</w:t>
-        <w:br/>
-        <w:br/>
-        <w:t>Your goodness is running after, it's running after me</w:t>
-        <w:br/>
-        <w:t>Your goodness is running after, it's running after me</w:t>
-        <w:br/>
-        <w:t>With my life laid down, I'm surrendered now</w:t>
-        <w:br/>
-        <w:t>I give You everything</w:t>
-        <w:br/>
-        <w:t>Your goodness is running after, it keeps running after me</w:t>
-        <w:br/>
-        <w:br/>
-        <w:t>[Chorus]</w:t>
-        <w:br/>
-        <w:t>'Cause all my life You have been faithful</w:t>
-        <w:br/>
-        <w:t>And all my life You have been so, so good</w:t>
-        <w:br/>
-        <w:t>With every breath that I am able</w:t>
-        <w:br/>
-        <w:t>Oh, I'm gonna sing of the goodness of God</w:t>
-        <w:br/>
-        <w:br/>
-        <w:t>[Outro]</w:t>
-        <w:br/>
-        <w:t>I'm gonna sing</w:t>
-        <w:br/>
-        <w:t>All my life You have been faithful</w:t>
-        <w:br/>
-        <w:t>All my life You have been so, so good</w:t>
-        <w:br/>
-        <w:t>With every breath that I am able</w:t>
-        <w:br/>
-        <w:t>I will sing of the goodness of God</w:t>
-        <w:br/>
-        <w:t>Oh, I'm gonna sing of the goodness of God</w:t>
+        <w:br w:type="page"/>
       </w:r>
     </w:p>
-    <w:p/>
     <w:p>
       <w:pPr>
-        <w:pStyle w:val="Heading2"/>
+        <w:spacing w:before="240" w:after="80"/>
       </w:pPr>
       <w:r>
         <w:rPr>
-          <w:color w:val="1E3A8A"/>
+          <w:rFonts w:ascii="Georgia" w:hAnsi="Georgia"/>
+          <w:b/>
+          <w:color w:val="1B365D"/>
+          <w:sz w:val="40"/>
         </w:rPr>
-        <w:t>#2. Gratitude</w:t>
+        <w:t>#3. Trust In God</w:t>
+      </w:r>
+    </w:p>
+    <w:p>
+      <w:pPr>
+        <w:spacing w:after="160"/>
+      </w:pPr>
+      <w:r>
+        <w:rPr>
+          <w:b/>
+          <w:color w:val="4A5568"/>
+          <w:sz w:val="24"/>
+        </w:rPr>
+        <w:t>Performed by Elevation Worship (feat. Chris Brown)</w:t>
+      </w:r>
+    </w:p>
+    <w:tbl>
+      <w:tblPr>
+        <w:tblW w:type="auto" w:w="0"/>
+        <w:jc w:val="center"/>
+        <w:tblLook w:firstColumn="1" w:firstRow="1" w:lastColumn="0" w:lastRow="0" w:noHBand="0" w:noVBand="1" w:val="04A0"/>
+      </w:tblPr>
+      <w:tblGrid>
+        <w:gridCol w:w="9936"/>
+      </w:tblGrid>
+      <w:tr>
+        <w:tc>
+          <w:tcPr>
+            <w:tcW w:type="dxa" w:w="9792"/>
+            <w:shd w:fill="F0F4F8"/>
+            <w:tcMar>
+              <w:top w:w="140" w:type="dxa"/>
+              <w:bottom w:w="140" w:type="dxa"/>
+              <w:left w:w="180" w:type="dxa"/>
+              <w:right w:w="180" w:type="dxa"/>
+            </w:tcMar>
+          </w:tcPr>
+          <w:p>
+            <w:r>
+              <w:t xml:space="preserve">🔗 Official Link: </w:t>
+            </w:r>
+            <w:hyperlink r:id="rId11">
+              <w:r>
+                <w:rPr>
+                  <w:rColor w:val="0056B3"/>
+                  <w:u w:val="single"/>
+                </w:rPr>
+                <w:t>Watch Official Lyric Video on YouTube</w:t>
+              </w:r>
+            </w:hyperlink>
+          </w:p>
+        </w:tc>
+      </w:tr>
+    </w:tbl>
+    <w:p>
+      <w:pPr>
+        <w:spacing w:before="360" w:after="200"/>
+      </w:pPr>
+      <w:r>
+        <w:rPr>
+          <w:rFonts w:ascii="Georgia" w:hAnsi="Georgia"/>
+          <w:b/>
+          <w:color w:val="2B4C7E"/>
+          <w:sz w:val="28"/>
+        </w:rPr>
+        <w:t>Lyrics</w:t>
+      </w:r>
+    </w:p>
+    <w:p>
+      <w:pPr>
+        <w:spacing w:after="200" w:line="276" w:lineRule="auto"/>
+      </w:pPr>
+      <w:r>
+        <w:rPr>
+          <w:rFonts w:ascii="Calibri" w:hAnsi="Calibri"/>
+          <w:sz w:val="22"/>
+        </w:rPr>
+        <w:t>Blessed assurance, Jesus is mine</w:t>
+        <w:br/>
+      </w:r>
+      <w:r>
+        <w:rPr>
+          <w:rFonts w:ascii="Calibri" w:hAnsi="Calibri"/>
+          <w:sz w:val="22"/>
+        </w:rPr>
+        <w:t>He’s been my fourth man in the fire, time after time</w:t>
+        <w:br/>
+      </w:r>
+      <w:r>
+        <w:rPr>
+          <w:rFonts w:ascii="Calibri" w:hAnsi="Calibri"/>
+          <w:sz w:val="22"/>
+        </w:rPr>
+        <w:t>Born of His Spirit, washed in His blood</w:t>
+        <w:br/>
+      </w:r>
+      <w:r>
+        <w:rPr>
+          <w:rFonts w:ascii="Calibri" w:hAnsi="Calibri"/>
+          <w:sz w:val="22"/>
+        </w:rPr>
+        <w:t>And what He did for me on Calvary is more than enough</w:t>
+        <w:br/>
+      </w:r>
+    </w:p>
+    <w:p>
+      <w:pPr>
+        <w:spacing w:before="160" w:after="40"/>
+      </w:pPr>
+      <w:r>
+        <w:rPr>
+          <w:b/>
+          <w:color w:val="718096"/>
+          <w:sz w:val="20"/>
+        </w:rPr>
+        <w:t>[Verse 1]</w:t>
+      </w:r>
+    </w:p>
+    <w:p>
+      <w:pPr>
+        <w:spacing w:after="200" w:line="276" w:lineRule="auto"/>
+      </w:pPr>
+      <w:r>
+        <w:rPr>
+          <w:rFonts w:ascii="Calibri" w:hAnsi="Calibri"/>
+          <w:sz w:val="22"/>
+        </w:rPr>
+        <w:t>I trust in God, my Savior</w:t>
+        <w:br/>
+      </w:r>
+      <w:r>
+        <w:rPr>
+          <w:rFonts w:ascii="Calibri" w:hAnsi="Calibri"/>
+          <w:sz w:val="22"/>
+        </w:rPr>
+        <w:t>The One who will never fail</w:t>
+        <w:br/>
+      </w:r>
+      <w:r>
+        <w:rPr>
+          <w:rFonts w:ascii="Calibri" w:hAnsi="Calibri"/>
+          <w:sz w:val="22"/>
+        </w:rPr>
+        <w:t>He will never fail</w:t>
+        <w:br/>
+      </w:r>
+    </w:p>
+    <w:p>
+      <w:pPr>
+        <w:spacing w:before="160" w:after="40"/>
+      </w:pPr>
+      <w:r>
+        <w:rPr>
+          <w:b/>
+          <w:color w:val="718096"/>
+          <w:sz w:val="20"/>
+        </w:rPr>
+        <w:t>[Chorus]</w:t>
+      </w:r>
+    </w:p>
+    <w:p>
+      <w:pPr>
+        <w:spacing w:after="200" w:line="276" w:lineRule="auto"/>
+      </w:pPr>
+      <w:r>
+        <w:rPr>
+          <w:rFonts w:ascii="Calibri" w:hAnsi="Calibri"/>
+          <w:sz w:val="22"/>
+        </w:rPr>
+        <w:t>Perfect submission, all is at rest</w:t>
+        <w:br/>
+      </w:r>
+      <w:r>
+        <w:rPr>
+          <w:rFonts w:ascii="Calibri" w:hAnsi="Calibri"/>
+          <w:sz w:val="22"/>
+        </w:rPr>
+        <w:t>I know the Author of tomorrow has ordered my steps</w:t>
+        <w:br/>
+      </w:r>
+      <w:r>
+        <w:rPr>
+          <w:rFonts w:ascii="Calibri" w:hAnsi="Calibri"/>
+          <w:sz w:val="22"/>
+        </w:rPr>
+        <w:t>So this is my story and this is my song</w:t>
+        <w:br/>
+      </w:r>
+      <w:r>
+        <w:rPr>
+          <w:rFonts w:ascii="Calibri" w:hAnsi="Calibri"/>
+          <w:sz w:val="22"/>
+        </w:rPr>
+        <w:t>Praising my risen King and Savior all the day long</w:t>
+        <w:br/>
+      </w:r>
+    </w:p>
+    <w:p>
+      <w:pPr>
+        <w:spacing w:before="160" w:after="40"/>
+      </w:pPr>
+      <w:r>
+        <w:rPr>
+          <w:b/>
+          <w:color w:val="718096"/>
+          <w:sz w:val="20"/>
+        </w:rPr>
+        <w:t>[Verse 2]</w:t>
+      </w:r>
+    </w:p>
+    <w:p>
+      <w:pPr>
+        <w:spacing w:after="200" w:line="276" w:lineRule="auto"/>
+      </w:pPr>
+      <w:r>
+        <w:rPr>
+          <w:rFonts w:ascii="Calibri" w:hAnsi="Calibri"/>
+          <w:sz w:val="22"/>
+        </w:rPr>
+        <w:t>I trust in God, my Savior</w:t>
+        <w:br/>
+      </w:r>
+      <w:r>
+        <w:rPr>
+          <w:rFonts w:ascii="Calibri" w:hAnsi="Calibri"/>
+          <w:sz w:val="22"/>
+        </w:rPr>
+        <w:t>The One who will never fail</w:t>
+        <w:br/>
+      </w:r>
+      <w:r>
+        <w:rPr>
+          <w:rFonts w:ascii="Calibri" w:hAnsi="Calibri"/>
+          <w:sz w:val="22"/>
+        </w:rPr>
+        <w:t>He will never fail</w:t>
+        <w:br/>
+      </w:r>
+    </w:p>
+    <w:p>
+      <w:pPr>
+        <w:spacing w:before="160" w:after="40"/>
+      </w:pPr>
+      <w:r>
+        <w:rPr>
+          <w:b/>
+          <w:color w:val="718096"/>
+          <w:sz w:val="20"/>
+        </w:rPr>
+        <w:t>[Chorus]</w:t>
+      </w:r>
+    </w:p>
+    <w:p>
+      <w:pPr>
+        <w:spacing w:after="200" w:line="276" w:lineRule="auto"/>
+      </w:pPr>
+      <w:r>
+        <w:rPr>
+          <w:rFonts w:ascii="Calibri" w:hAnsi="Calibri"/>
+          <w:sz w:val="22"/>
+        </w:rPr>
+        <w:t>I sought the Lord and He heard and He answered</w:t>
+        <w:br/>
+      </w:r>
+      <w:r>
+        <w:rPr>
+          <w:rFonts w:ascii="Calibri" w:hAnsi="Calibri"/>
+          <w:sz w:val="22"/>
+        </w:rPr>
+        <w:t>I sought the Lord and He heard and He answered</w:t>
+        <w:br/>
+      </w:r>
+      <w:r>
+        <w:rPr>
+          <w:rFonts w:ascii="Calibri" w:hAnsi="Calibri"/>
+          <w:sz w:val="22"/>
+        </w:rPr>
+        <w:t>I sought the Lord and He heard and He answered</w:t>
+        <w:br/>
+      </w:r>
+      <w:r>
+        <w:rPr>
+          <w:rFonts w:ascii="Calibri" w:hAnsi="Calibri"/>
+          <w:sz w:val="22"/>
+        </w:rPr>
+        <w:t>That’s why I trust Him</w:t>
+        <w:br/>
+      </w:r>
+      <w:r>
+        <w:rPr>
+          <w:rFonts w:ascii="Calibri" w:hAnsi="Calibri"/>
+          <w:sz w:val="22"/>
+        </w:rPr>
+        <w:t>That’s why I trust Him</w:t>
+        <w:br/>
+      </w:r>
+    </w:p>
+    <w:p>
+      <w:pPr>
+        <w:spacing w:before="160" w:after="40"/>
+      </w:pPr>
+      <w:r>
+        <w:rPr>
+          <w:b/>
+          <w:color w:val="718096"/>
+          <w:sz w:val="20"/>
+        </w:rPr>
+        <w:t>[Bridge]</w:t>
+      </w:r>
+    </w:p>
+    <w:p>
+      <w:pPr>
+        <w:spacing w:after="200" w:line="276" w:lineRule="auto"/>
+      </w:pPr>
+      <w:r>
+        <w:rPr>
+          <w:rFonts w:ascii="Calibri" w:hAnsi="Calibri"/>
+          <w:sz w:val="22"/>
+        </w:rPr>
+        <w:t>I trust in God, my Savior</w:t>
+        <w:br/>
+      </w:r>
+      <w:r>
+        <w:rPr>
+          <w:rFonts w:ascii="Calibri" w:hAnsi="Calibri"/>
+          <w:sz w:val="22"/>
+        </w:rPr>
+        <w:t>The One who will never fail</w:t>
+        <w:br/>
+      </w:r>
+      <w:r>
+        <w:rPr>
+          <w:rFonts w:ascii="Calibri" w:hAnsi="Calibri"/>
+          <w:sz w:val="22"/>
+        </w:rPr>
+        <w:t>He will never fail</w:t>
+        <w:br/>
+      </w:r>
+    </w:p>
+    <w:p>
+      <w:pPr>
+        <w:spacing w:before="160" w:after="40"/>
+      </w:pPr>
+      <w:r>
+        <w:rPr>
+          <w:b/>
+          <w:color w:val="718096"/>
+          <w:sz w:val="20"/>
+        </w:rPr>
+        <w:t>[Chorus]</w:t>
       </w:r>
     </w:p>
     <w:p>
       <w:r>
+        <w:br w:type="page"/>
+      </w:r>
+    </w:p>
+    <w:p>
+      <w:pPr>
+        <w:spacing w:before="240" w:after="80"/>
+      </w:pPr>
+      <w:r>
+        <w:rPr>
+          <w:rFonts w:ascii="Georgia" w:hAnsi="Georgia"/>
+          <w:b/>
+          <w:color w:val="1B365D"/>
+          <w:sz w:val="40"/>
+        </w:rPr>
+        <w:t>#4. Church</w:t>
+      </w:r>
+    </w:p>
+    <w:p>
+      <w:pPr>
+        <w:spacing w:after="160"/>
+      </w:pPr>
+      <w:r>
         <w:rPr>
           <w:b/>
+          <w:color w:val="4A5568"/>
+          <w:sz w:val="24"/>
         </w:rPr>
-        <w:t xml:space="preserve">Artist: </w:t>
+        <w:t>Performed by Tasha Cobbs Leonard (feat. John Legend)</w:t>
       </w:r>
+    </w:p>
+    <w:tbl>
+      <w:tblPr>
+        <w:tblW w:type="auto" w:w="0"/>
+        <w:jc w:val="center"/>
+        <w:tblLook w:firstColumn="1" w:firstRow="1" w:lastColumn="0" w:lastRow="0" w:noHBand="0" w:noVBand="1" w:val="04A0"/>
+      </w:tblPr>
+      <w:tblGrid>
+        <w:gridCol w:w="9936"/>
+      </w:tblGrid>
+      <w:tr>
+        <w:tc>
+          <w:tcPr>
+            <w:tcW w:type="dxa" w:w="9792"/>
+            <w:shd w:fill="F0F4F8"/>
+            <w:tcMar>
+              <w:top w:w="140" w:type="dxa"/>
+              <w:bottom w:w="140" w:type="dxa"/>
+              <w:left w:w="180" w:type="dxa"/>
+              <w:right w:w="180" w:type="dxa"/>
+            </w:tcMar>
+          </w:tcPr>
+          <w:p>
+            <w:r>
+              <w:t xml:space="preserve">🔗 Official Link: </w:t>
+            </w:r>
+            <w:hyperlink r:id="rId12">
+              <w:r>
+                <w:rPr>
+                  <w:rColor w:val="0056B3"/>
+                  <w:u w:val="single"/>
+                </w:rPr>
+                <w:t>Watch Official Music Video on YouTube</w:t>
+              </w:r>
+            </w:hyperlink>
+          </w:p>
+        </w:tc>
+      </w:tr>
+    </w:tbl>
+    <w:p>
+      <w:pPr>
+        <w:spacing w:before="360" w:after="200"/>
+      </w:pPr>
       <w:r>
-        <w:t>Brandon Lake</w:t>
+        <w:rPr>
+          <w:rFonts w:ascii="Georgia" w:hAnsi="Georgia"/>
+          <w:b/>
+          <w:color w:val="2B4C7E"/>
+          <w:sz w:val="28"/>
+        </w:rPr>
+        <w:t>Lyrics</w:t>
+      </w:r>
+    </w:p>
+    <w:p>
+      <w:pPr>
+        <w:spacing w:after="200" w:line="276" w:lineRule="auto"/>
+      </w:pPr>
+      <w:r>
+        <w:rPr>
+          <w:rFonts w:ascii="Calibri" w:hAnsi="Calibri"/>
+          <w:sz w:val="22"/>
+        </w:rPr>
+        <w:t>Where is the choir?</w:t>
         <w:br/>
       </w:r>
       <w:r>
         <w:rPr>
-          <w:b/>
+          <w:rFonts w:ascii="Calibri" w:hAnsi="Calibri"/>
+          <w:sz w:val="22"/>
         </w:rPr>
-        <w:t xml:space="preserve">Official Link: </w:t>
+        <w:t>I can't hear them singing</w:t>
+        <w:br/>
       </w:r>
       <w:r>
         <w:rPr>
-          <w:color w:val="2563EB"/>
-          <w:u w:val="single"/>
+          <w:rFonts w:ascii="Calibri" w:hAnsi="Calibri"/>
+          <w:sz w:val="22"/>
         </w:rPr>
-        <w:t>https://www.youtube.com/watch?v=R5H1t4D7k4g</w:t>
+        <w:t>Where is the preacher?</w:t>
+        <w:br/>
+      </w:r>
+      <w:r>
+        <w:rPr>
+          <w:rFonts w:ascii="Calibri" w:hAnsi="Calibri"/>
+          <w:sz w:val="22"/>
+        </w:rPr>
+        <w:t>I can't hear him preaching</w:t>
+        <w:br/>
+      </w:r>
+      <w:r>
+        <w:rPr>
+          <w:rFonts w:ascii="Calibri" w:hAnsi="Calibri"/>
+          <w:sz w:val="22"/>
+        </w:rPr>
+        <w:t>Where are those church bells?</w:t>
+        <w:br/>
+      </w:r>
+      <w:r>
+        <w:rPr>
+          <w:rFonts w:ascii="Calibri" w:hAnsi="Calibri"/>
+          <w:sz w:val="22"/>
+        </w:rPr>
+        <w:t>I don't hear them ringing</w:t>
+        <w:br/>
+      </w:r>
+      <w:r>
+        <w:rPr>
+          <w:rFonts w:ascii="Calibri" w:hAnsi="Calibri"/>
+          <w:sz w:val="22"/>
+        </w:rPr>
+        <w:t>Where's is that feeling?</w:t>
+        <w:br/>
+      </w:r>
+      <w:r>
+        <w:rPr>
+          <w:rFonts w:ascii="Calibri" w:hAnsi="Calibri"/>
+          <w:sz w:val="22"/>
+        </w:rPr>
+        <w:t>Where's the piano with all of its banging?</w:t>
+        <w:br/>
+      </w:r>
+      <w:r>
+        <w:rPr>
+          <w:rFonts w:ascii="Calibri" w:hAnsi="Calibri"/>
+          <w:sz w:val="22"/>
+        </w:rPr>
+        <w:t>Where are those people with all of their praising?</w:t>
+        <w:br/>
+      </w:r>
+      <w:r>
+        <w:rPr>
+          <w:rFonts w:ascii="Calibri" w:hAnsi="Calibri"/>
+          <w:sz w:val="22"/>
+        </w:rPr>
+        <w:t>All the emotions that I have been chasing</w:t>
+        <w:br/>
+      </w:r>
+      <w:r>
+        <w:rPr>
+          <w:rFonts w:ascii="Calibri" w:hAnsi="Calibri"/>
+          <w:sz w:val="22"/>
+        </w:rPr>
+        <w:t>Where is that feeling?</w:t>
+        <w:br/>
+      </w:r>
+    </w:p>
+    <w:p>
+      <w:pPr>
+        <w:spacing w:before="160" w:after="40"/>
+      </w:pPr>
+      <w:r>
+        <w:rPr>
+          <w:b/>
+          <w:color w:val="718096"/>
+          <w:sz w:val="20"/>
+        </w:rPr>
+        <w:t>[Verse 1]</w:t>
+      </w:r>
+    </w:p>
+    <w:p>
+      <w:pPr>
+        <w:spacing w:after="200" w:line="276" w:lineRule="auto"/>
+      </w:pPr>
+      <w:r>
+        <w:rPr>
+          <w:rFonts w:ascii="Calibri" w:hAnsi="Calibri"/>
+          <w:sz w:val="22"/>
+        </w:rPr>
+        <w:t>God, it's just You and me now</w:t>
+        <w:br/>
+      </w:r>
+      <w:r>
+        <w:rPr>
+          <w:rFonts w:ascii="Calibri" w:hAnsi="Calibri"/>
+          <w:sz w:val="22"/>
+        </w:rPr>
+        <w:t>Tell me what to do now</w:t>
+        <w:br/>
+      </w:r>
+      <w:r>
+        <w:rPr>
+          <w:rFonts w:ascii="Calibri" w:hAnsi="Calibri"/>
+          <w:sz w:val="22"/>
+        </w:rPr>
+        <w:t>Teach me how to have church on a Monday</w:t>
+        <w:br/>
+      </w:r>
+    </w:p>
+    <w:p>
+      <w:pPr>
+        <w:spacing w:before="160" w:after="40"/>
+      </w:pPr>
+      <w:r>
+        <w:rPr>
+          <w:b/>
+          <w:color w:val="718096"/>
+          <w:sz w:val="20"/>
+        </w:rPr>
+        <w:t>[Pre-Chorus]</w:t>
+      </w:r>
+    </w:p>
+    <w:p>
+      <w:pPr>
+        <w:spacing w:after="200" w:line="276" w:lineRule="auto"/>
+      </w:pPr>
+      <w:r>
+        <w:rPr>
+          <w:rFonts w:ascii="Calibri" w:hAnsi="Calibri"/>
+          <w:sz w:val="22"/>
+        </w:rPr>
+        <w:t>You can be my company</w:t>
+        <w:br/>
+      </w:r>
+      <w:r>
+        <w:rPr>
+          <w:rFonts w:ascii="Calibri" w:hAnsi="Calibri"/>
+          <w:sz w:val="22"/>
+        </w:rPr>
+        <w:t>Here's my heart, take the lead</w:t>
+        <w:br/>
+      </w:r>
+      <w:r>
+        <w:rPr>
+          <w:rFonts w:ascii="Calibri" w:hAnsi="Calibri"/>
+          <w:sz w:val="22"/>
+        </w:rPr>
+        <w:t>Teach me how to have church on a Monday</w:t>
+        <w:br/>
+      </w:r>
+    </w:p>
+    <w:p>
+      <w:pPr>
+        <w:spacing w:before="160" w:after="40"/>
+      </w:pPr>
+      <w:r>
+        <w:rPr>
+          <w:b/>
+          <w:color w:val="718096"/>
+          <w:sz w:val="20"/>
+        </w:rPr>
+        <w:t>[Chorus]</w:t>
+      </w:r>
+    </w:p>
+    <w:p>
+      <w:pPr>
+        <w:spacing w:after="200" w:line="276" w:lineRule="auto"/>
+      </w:pPr>
+      <w:r>
+        <w:rPr>
+          <w:rFonts w:ascii="Calibri" w:hAnsi="Calibri"/>
+          <w:sz w:val="22"/>
+        </w:rPr>
+        <w:t>Now I'm understanding</w:t>
+        <w:br/>
+      </w:r>
+      <w:r>
+        <w:rPr>
+          <w:rFonts w:ascii="Calibri" w:hAnsi="Calibri"/>
+          <w:sz w:val="22"/>
+        </w:rPr>
+        <w:t>You're more than a building</w:t>
+        <w:br/>
+      </w:r>
+      <w:r>
+        <w:rPr>
+          <w:rFonts w:ascii="Calibri" w:hAnsi="Calibri"/>
+          <w:sz w:val="22"/>
+        </w:rPr>
+        <w:t>When the service is over</w:t>
+        <w:br/>
+      </w:r>
+      <w:r>
+        <w:rPr>
+          <w:rFonts w:ascii="Calibri" w:hAnsi="Calibri"/>
+          <w:sz w:val="22"/>
+        </w:rPr>
+        <w:t>I'll still be singing</w:t>
+        <w:br/>
+      </w:r>
+      <w:r>
+        <w:rPr>
+          <w:rFonts w:ascii="Calibri" w:hAnsi="Calibri"/>
+          <w:sz w:val="22"/>
+        </w:rPr>
+        <w:t>And You'll meet me right here</w:t>
+        <w:br/>
+      </w:r>
+      <w:r>
+        <w:rPr>
+          <w:rFonts w:ascii="Calibri" w:hAnsi="Calibri"/>
+          <w:sz w:val="22"/>
+        </w:rPr>
+        <w:t>And God I'll be waiting</w:t>
+        <w:br/>
+      </w:r>
+      <w:r>
+        <w:rPr>
+          <w:rFonts w:ascii="Calibri" w:hAnsi="Calibri"/>
+          <w:sz w:val="22"/>
+        </w:rPr>
+        <w:t>Oh, what a feeling</w:t>
+        <w:br/>
+      </w:r>
+    </w:p>
+    <w:p>
+      <w:pPr>
+        <w:spacing w:before="160" w:after="40"/>
+      </w:pPr>
+      <w:r>
+        <w:rPr>
+          <w:b/>
+          <w:color w:val="718096"/>
+          <w:sz w:val="20"/>
+        </w:rPr>
+        <w:t>[Verse 2]</w:t>
+      </w:r>
+    </w:p>
+    <w:p>
+      <w:pPr>
+        <w:spacing w:after="200" w:line="276" w:lineRule="auto"/>
+      </w:pPr>
+      <w:r>
+        <w:rPr>
+          <w:rFonts w:ascii="Calibri" w:hAnsi="Calibri"/>
+          <w:sz w:val="22"/>
+        </w:rPr>
+        <w:t>You can be our company</w:t>
+        <w:br/>
+      </w:r>
+      <w:r>
+        <w:rPr>
+          <w:rFonts w:ascii="Calibri" w:hAnsi="Calibri"/>
+          <w:sz w:val="22"/>
+        </w:rPr>
+        <w:t>Here's our heart, You take the lead</w:t>
+        <w:br/>
+      </w:r>
+      <w:r>
+        <w:rPr>
+          <w:rFonts w:ascii="Calibri" w:hAnsi="Calibri"/>
+          <w:sz w:val="22"/>
+        </w:rPr>
+        <w:t>Teach us how to have church on Sunday</w:t>
+        <w:br/>
+      </w:r>
+    </w:p>
+    <w:p>
+      <w:pPr>
+        <w:spacing w:before="160" w:after="40"/>
+      </w:pPr>
+      <w:r>
+        <w:rPr>
+          <w:b/>
+          <w:color w:val="718096"/>
+          <w:sz w:val="20"/>
+        </w:rPr>
+        <w:t>[Chorus]</w:t>
       </w:r>
     </w:p>
     <w:p>
       <w:r>
+        <w:br w:type="page"/>
+      </w:r>
+    </w:p>
+    <w:p>
+      <w:pPr>
+        <w:spacing w:before="240" w:after="80"/>
+      </w:pPr>
+      <w:r>
+        <w:rPr>
+          <w:rFonts w:ascii="Georgia" w:hAnsi="Georgia"/>
+          <w:b/>
+          <w:color w:val="1B365D"/>
+          <w:sz w:val="40"/>
+        </w:rPr>
+        <w:t>#5. Come Jesus Come</w:t>
+      </w:r>
+    </w:p>
+    <w:p>
+      <w:pPr>
+        <w:spacing w:after="160"/>
+      </w:pPr>
+      <w:r>
         <w:rPr>
           <w:b/>
-          <w:color w:val="374151"/>
+          <w:color w:val="4A5568"/>
+          <w:sz w:val="24"/>
         </w:rPr>
-        <w:t>Lyrics:</w:t>
+        <w:t>Performed by CeCe Winans / Stephen McWhirter</w:t>
+      </w:r>
+    </w:p>
+    <w:tbl>
+      <w:tblPr>
+        <w:tblW w:type="auto" w:w="0"/>
+        <w:jc w:val="center"/>
+        <w:tblLook w:firstColumn="1" w:firstRow="1" w:lastColumn="0" w:lastRow="0" w:noHBand="0" w:noVBand="1" w:val="04A0"/>
+      </w:tblPr>
+      <w:tblGrid>
+        <w:gridCol w:w="9936"/>
+      </w:tblGrid>
+      <w:tr>
+        <w:tc>
+          <w:tcPr>
+            <w:tcW w:type="dxa" w:w="9792"/>
+            <w:shd w:fill="F0F4F8"/>
+            <w:tcMar>
+              <w:top w:w="140" w:type="dxa"/>
+              <w:bottom w:w="140" w:type="dxa"/>
+              <w:left w:w="180" w:type="dxa"/>
+              <w:right w:w="180" w:type="dxa"/>
+            </w:tcMar>
+          </w:tcPr>
+          <w:p>
+            <w:r>
+              <w:t xml:space="preserve">🔗 Official Link: </w:t>
+            </w:r>
+            <w:hyperlink r:id="rId13">
+              <w:r>
+                <w:rPr>
+                  <w:rColor w:val="0056B3"/>
+                  <w:u w:val="single"/>
+                </w:rPr>
+                <w:t>Watch Official Video on YouTube</w:t>
+              </w:r>
+            </w:hyperlink>
+          </w:p>
+        </w:tc>
+      </w:tr>
+    </w:tbl>
+    <w:p>
+      <w:pPr>
+        <w:spacing w:before="360" w:after="200"/>
+      </w:pPr>
+      <w:r>
+        <w:rPr>
+          <w:rFonts w:ascii="Georgia" w:hAnsi="Georgia"/>
+          <w:b/>
+          <w:color w:val="2B4C7E"/>
+          <w:sz w:val="28"/>
+        </w:rPr>
+        <w:t>Lyrics</w:t>
+      </w:r>
+    </w:p>
+    <w:p>
+      <w:pPr>
+        <w:spacing w:after="200" w:line="276" w:lineRule="auto"/>
+      </w:pPr>
+      <w:r>
+        <w:rPr>
+          <w:rFonts w:ascii="Calibri" w:hAnsi="Calibri"/>
+          <w:sz w:val="22"/>
+        </w:rPr>
+        <w:t>Sometimes I fall to my knees and pray</w:t>
+        <w:br/>
+      </w:r>
+      <w:r>
+        <w:rPr>
+          <w:rFonts w:ascii="Calibri" w:hAnsi="Calibri"/>
+          <w:sz w:val="22"/>
+        </w:rPr>
+        <w:t>Come Jesus come, let today be the day</w:t>
+        <w:br/>
+      </w:r>
+      <w:r>
+        <w:rPr>
+          <w:rFonts w:ascii="Calibri" w:hAnsi="Calibri"/>
+          <w:sz w:val="22"/>
+        </w:rPr>
+        <w:t>Sometimes I feel like I'm gonna break</w:t>
+        <w:br/>
+      </w:r>
+      <w:r>
+        <w:rPr>
+          <w:rFonts w:ascii="Calibri" w:hAnsi="Calibri"/>
+          <w:sz w:val="22"/>
+        </w:rPr>
+        <w:t>But I'm holding on to a hope that won't fade</w:t>
+        <w:br/>
+      </w:r>
+    </w:p>
+    <w:p>
+      <w:pPr>
+        <w:spacing w:before="160" w:after="40"/>
+      </w:pPr>
+      <w:r>
+        <w:rPr>
+          <w:b/>
+          <w:color w:val="718096"/>
+          <w:sz w:val="20"/>
+        </w:rPr>
+        <w:t>[Verse 1]</w:t>
+      </w:r>
+    </w:p>
+    <w:p>
+      <w:pPr>
+        <w:spacing w:after="200" w:line="276" w:lineRule="auto"/>
+      </w:pPr>
+      <w:r>
+        <w:rPr>
+          <w:rFonts w:ascii="Calibri" w:hAnsi="Calibri"/>
+          <w:sz w:val="22"/>
+        </w:rPr>
+        <w:t>Come Jesus come</w:t>
+        <w:br/>
+      </w:r>
+      <w:r>
+        <w:rPr>
+          <w:rFonts w:ascii="Calibri" w:hAnsi="Calibri"/>
+          <w:sz w:val="22"/>
+        </w:rPr>
+        <w:t>We've been waiting so long</w:t>
+        <w:br/>
+      </w:r>
+      <w:r>
+        <w:rPr>
+          <w:rFonts w:ascii="Calibri" w:hAnsi="Calibri"/>
+          <w:sz w:val="22"/>
+        </w:rPr>
+        <w:t>For the day You return</w:t>
+        <w:br/>
+      </w:r>
+      <w:r>
+        <w:rPr>
+          <w:rFonts w:ascii="Calibri" w:hAnsi="Calibri"/>
+          <w:sz w:val="22"/>
+        </w:rPr>
+        <w:t>To heal every hurt and right every wrong</w:t>
+        <w:br/>
+      </w:r>
+      <w:r>
+        <w:rPr>
+          <w:rFonts w:ascii="Calibri" w:hAnsi="Calibri"/>
+          <w:sz w:val="22"/>
+        </w:rPr>
+        <w:t>We need You right now</w:t>
+        <w:br/>
+      </w:r>
+      <w:r>
+        <w:rPr>
+          <w:rFonts w:ascii="Calibri" w:hAnsi="Calibri"/>
+          <w:sz w:val="22"/>
+        </w:rPr>
+        <w:t>Come and turn this around</w:t>
+        <w:br/>
+      </w:r>
+      <w:r>
+        <w:rPr>
+          <w:rFonts w:ascii="Calibri" w:hAnsi="Calibri"/>
+          <w:sz w:val="22"/>
+        </w:rPr>
+        <w:t>Deep down I know this world isn't home</w:t>
+        <w:br/>
+      </w:r>
+      <w:r>
+        <w:rPr>
+          <w:rFonts w:ascii="Calibri" w:hAnsi="Calibri"/>
+          <w:sz w:val="22"/>
+        </w:rPr>
+        <w:t>Come Jesus come</w:t>
+        <w:br/>
+      </w:r>
+    </w:p>
+    <w:p>
+      <w:pPr>
+        <w:spacing w:before="160" w:after="40"/>
+      </w:pPr>
+      <w:r>
+        <w:rPr>
+          <w:b/>
+          <w:color w:val="718096"/>
+          <w:sz w:val="20"/>
+        </w:rPr>
+        <w:t>[Chorus]</w:t>
+      </w:r>
+    </w:p>
+    <w:p>
+      <w:pPr>
+        <w:spacing w:after="200" w:line="276" w:lineRule="auto"/>
+      </w:pPr>
+      <w:r>
+        <w:rPr>
+          <w:rFonts w:ascii="Calibri" w:hAnsi="Calibri"/>
+          <w:sz w:val="22"/>
+        </w:rPr>
+        <w:t>There'll be no war and there'll be no chains</w:t>
+        <w:br/>
+      </w:r>
+      <w:r>
+        <w:rPr>
+          <w:rFonts w:ascii="Calibri" w:hAnsi="Calibri"/>
+          <w:sz w:val="22"/>
+        </w:rPr>
+        <w:t>When Jesus comes, let today be the day</w:t>
+        <w:br/>
+      </w:r>
+      <w:r>
+        <w:rPr>
+          <w:rFonts w:ascii="Calibri" w:hAnsi="Calibri"/>
+          <w:sz w:val="22"/>
+        </w:rPr>
+        <w:t>He'll come for the weak and the strong just the same</w:t>
+        <w:br/>
+      </w:r>
+      <w:r>
+        <w:rPr>
+          <w:rFonts w:ascii="Calibri" w:hAnsi="Calibri"/>
+          <w:sz w:val="22"/>
+        </w:rPr>
+        <w:t>And all will believe in the power of His name</w:t>
+        <w:br/>
+      </w:r>
+    </w:p>
+    <w:p>
+      <w:pPr>
+        <w:spacing w:before="160" w:after="40"/>
+      </w:pPr>
+      <w:r>
+        <w:rPr>
+          <w:b/>
+          <w:color w:val="718096"/>
+          <w:sz w:val="20"/>
+        </w:rPr>
+        <w:t>[Verse 2]</w:t>
+      </w:r>
+    </w:p>
+    <w:p>
+      <w:pPr>
+        <w:spacing w:after="200" w:line="276" w:lineRule="auto"/>
+      </w:pPr>
+      <w:r>
+        <w:rPr>
+          <w:rFonts w:ascii="Calibri" w:hAnsi="Calibri"/>
+          <w:sz w:val="22"/>
+        </w:rPr>
+        <w:t>Come Jesus come</w:t>
+        <w:br/>
+      </w:r>
+      <w:r>
+        <w:rPr>
+          <w:rFonts w:ascii="Calibri" w:hAnsi="Calibri"/>
+          <w:sz w:val="22"/>
+        </w:rPr>
+        <w:t>We've been waiting so long</w:t>
+        <w:br/>
+      </w:r>
+      <w:r>
+        <w:rPr>
+          <w:rFonts w:ascii="Calibri" w:hAnsi="Calibri"/>
+          <w:sz w:val="22"/>
+        </w:rPr>
+        <w:t>For the day You return</w:t>
+        <w:br/>
+      </w:r>
+      <w:r>
+        <w:rPr>
+          <w:rFonts w:ascii="Calibri" w:hAnsi="Calibri"/>
+          <w:sz w:val="22"/>
+        </w:rPr>
+        <w:t>To heal every hurt and right every wrong</w:t>
+        <w:br/>
+      </w:r>
+      <w:r>
+        <w:rPr>
+          <w:rFonts w:ascii="Calibri" w:hAnsi="Calibri"/>
+          <w:sz w:val="22"/>
+        </w:rPr>
+        <w:t>We need You right now</w:t>
+        <w:br/>
+      </w:r>
+      <w:r>
+        <w:rPr>
+          <w:rFonts w:ascii="Calibri" w:hAnsi="Calibri"/>
+          <w:sz w:val="22"/>
+        </w:rPr>
+        <w:t>Come and turn this around</w:t>
+        <w:br/>
+      </w:r>
+      <w:r>
+        <w:rPr>
+          <w:rFonts w:ascii="Calibri" w:hAnsi="Calibri"/>
+          <w:sz w:val="22"/>
+        </w:rPr>
+        <w:t>Deep down I know this world isn't home</w:t>
+        <w:br/>
+      </w:r>
+      <w:r>
+        <w:rPr>
+          <w:rFonts w:ascii="Calibri" w:hAnsi="Calibri"/>
+          <w:sz w:val="22"/>
+        </w:rPr>
+        <w:t>Come Jesus come</w:t>
+        <w:br/>
+      </w:r>
+    </w:p>
+    <w:p>
+      <w:pPr>
+        <w:spacing w:before="160" w:after="40"/>
+      </w:pPr>
+      <w:r>
+        <w:rPr>
+          <w:b/>
+          <w:color w:val="718096"/>
+          <w:sz w:val="20"/>
+        </w:rPr>
+        <w:t>[Chorus]</w:t>
+      </w:r>
+    </w:p>
+    <w:p>
+      <w:pPr>
+        <w:spacing w:after="200" w:line="276" w:lineRule="auto"/>
+      </w:pPr>
+      <w:r>
+        <w:rPr>
+          <w:rFonts w:ascii="Calibri" w:hAnsi="Calibri"/>
+          <w:sz w:val="22"/>
+        </w:rPr>
+        <w:t>One day He'll come and we'll stand face to face</w:t>
+        <w:br/>
+      </w:r>
+      <w:r>
+        <w:rPr>
+          <w:rFonts w:ascii="Calibri" w:hAnsi="Calibri"/>
+          <w:sz w:val="22"/>
+        </w:rPr>
+        <w:t>Come and lay it all down 'cause it might be today</w:t>
+        <w:br/>
+      </w:r>
+      <w:r>
+        <w:rPr>
+          <w:rFonts w:ascii="Calibri" w:hAnsi="Calibri"/>
+          <w:sz w:val="22"/>
+        </w:rPr>
+        <w:t>The time is right now, there's no need to wait</w:t>
+        <w:br/>
+      </w:r>
+      <w:r>
+        <w:rPr>
+          <w:rFonts w:ascii="Calibri" w:hAnsi="Calibri"/>
+          <w:sz w:val="22"/>
+        </w:rPr>
+        <w:t>Your past will be washed by rivers of grace</w:t>
+        <w:br/>
+      </w:r>
+    </w:p>
+    <w:p>
+      <w:pPr>
+        <w:spacing w:before="160" w:after="40"/>
+      </w:pPr>
+      <w:r>
+        <w:rPr>
+          <w:b/>
+          <w:color w:val="718096"/>
+          <w:sz w:val="20"/>
+        </w:rPr>
+        <w:t>[Bridge]</w:t>
+      </w:r>
+    </w:p>
+    <w:p>
+      <w:pPr>
+        <w:spacing w:after="200" w:line="276" w:lineRule="auto"/>
+      </w:pPr>
+      <w:r>
+        <w:rPr>
+          <w:rFonts w:ascii="Calibri" w:hAnsi="Calibri"/>
+          <w:sz w:val="22"/>
+        </w:rPr>
+        <w:t>Come Jesus come</w:t>
+        <w:br/>
+      </w:r>
+      <w:r>
+        <w:rPr>
+          <w:rFonts w:ascii="Calibri" w:hAnsi="Calibri"/>
+          <w:sz w:val="22"/>
+        </w:rPr>
+        <w:t>We've been waiting so long</w:t>
+        <w:br/>
+      </w:r>
+      <w:r>
+        <w:rPr>
+          <w:rFonts w:ascii="Calibri" w:hAnsi="Calibri"/>
+          <w:sz w:val="22"/>
+        </w:rPr>
+        <w:t>For the day You return</w:t>
+        <w:br/>
+      </w:r>
+      <w:r>
+        <w:rPr>
+          <w:rFonts w:ascii="Calibri" w:hAnsi="Calibri"/>
+          <w:sz w:val="22"/>
+        </w:rPr>
+        <w:t>To heal every hurt and right every wrong</w:t>
+        <w:br/>
+      </w:r>
+      <w:r>
+        <w:rPr>
+          <w:rFonts w:ascii="Calibri" w:hAnsi="Calibri"/>
+          <w:sz w:val="22"/>
+        </w:rPr>
+        <w:t>We need You right now</w:t>
+        <w:br/>
+      </w:r>
+      <w:r>
+        <w:rPr>
+          <w:rFonts w:ascii="Calibri" w:hAnsi="Calibri"/>
+          <w:sz w:val="22"/>
+        </w:rPr>
+        <w:t>Come and turn this around</w:t>
+        <w:br/>
+      </w:r>
+      <w:r>
+        <w:rPr>
+          <w:rFonts w:ascii="Calibri" w:hAnsi="Calibri"/>
+          <w:sz w:val="22"/>
+        </w:rPr>
+        <w:t>Deep down I know this world isn't home</w:t>
+        <w:br/>
+      </w:r>
+      <w:r>
+        <w:rPr>
+          <w:rFonts w:ascii="Calibri" w:hAnsi="Calibri"/>
+          <w:sz w:val="22"/>
+        </w:rPr>
+        <w:t>Come Jesus come</w:t>
+        <w:br/>
+      </w:r>
+    </w:p>
+    <w:p>
+      <w:pPr>
+        <w:spacing w:before="160" w:after="40"/>
+      </w:pPr>
+      <w:r>
+        <w:rPr>
+          <w:b/>
+          <w:color w:val="718096"/>
+          <w:sz w:val="20"/>
+        </w:rPr>
+        <w:t>[Chorus]</w:t>
       </w:r>
     </w:p>
     <w:p>
       <w:r>
-        <w:rPr>
-          <w:rFonts w:ascii="Georgia" w:hAnsi="Georgia"/>
-          <w:color w:val="1F2937"/>
-          <w:sz w:val="21"/>
-        </w:rPr>
-        <w:t>[Verse 1]</w:t>
-        <w:br/>
-        <w:t>All my words fall short</w:t>
-        <w:br/>
-        <w:t>I got nothing new</w:t>
-        <w:br/>
-        <w:t>How could I express</w:t>
-        <w:br/>
-        <w:t>All my gratitude?</w:t>
-        <w:br/>
-        <w:br/>
-        <w:t>[Verse 2]</w:t>
-        <w:br/>
-        <w:t>I could sing these songs</w:t>
-        <w:br/>
-        <w:t>As I often do</w:t>
-        <w:br/>
-        <w:t>But every song must end</w:t>
-        <w:br/>
-        <w:t>And You never do</w:t>
-        <w:br/>
-        <w:br/>
-        <w:t>[Verse 3]</w:t>
-        <w:br/>
-        <w:t>I've got one response</w:t>
-        <w:br/>
-        <w:t>I've got just one move</w:t>
-        <w:br/>
-        <w:t>With my arms stretched wide</w:t>
-        <w:br/>
-        <w:t>I will worship You</w:t>
-        <w:br/>
-        <w:br/>
-        <w:t>[Chorus]</w:t>
-        <w:br/>
-        <w:t>So I throw up my hands</w:t>
-        <w:br/>
-        <w:t>And praise You again and again</w:t>
-        <w:br/>
-        <w:t>'Cause all that I have is a hallelujah</w:t>
-        <w:br/>
-        <w:t>Hallelujah</w:t>
-        <w:br/>
-        <w:t>And I know it's not much</w:t>
-        <w:br/>
-        <w:t>But I've nothing else fit for a King</w:t>
-        <w:br/>
-        <w:t>Except for a heart singing hallelujah</w:t>
-        <w:br/>
-        <w:t>Hallelujah</w:t>
-        <w:br/>
-        <w:br/>
-        <w:t>[Bridge]</w:t>
-        <w:br/>
-        <w:t>So come on, my soul</w:t>
-        <w:br/>
-        <w:t>Oh, don't you get shy on me</w:t>
-        <w:br/>
-        <w:t>Lift up your song</w:t>
-        <w:br/>
-        <w:t>'Cause you've got a lion inside of those lungs</w:t>
-        <w:br/>
-        <w:t>Get up and praise the Lord</w:t>
-        <w:br/>
-        <w:br/>
-        <w:t>[Chorus]</w:t>
-        <w:br/>
-        <w:t>So I throw up my hands</w:t>
-        <w:br/>
-        <w:t>And praise You again and again</w:t>
-        <w:br/>
-        <w:t>'Cause all that I have is a hallelujah</w:t>
-        <w:br/>
-        <w:t>Hallelujah</w:t>
-        <w:br/>
-        <w:t>And I know it's not much</w:t>
-        <w:br/>
-        <w:t>But I've nothing else fit for a King</w:t>
-        <w:br/>
-        <w:t>Except for a heart singing hallelujah</w:t>
-        <w:br/>
-        <w:t>Hallelujah</w:t>
+        <w:br w:type="page"/>
       </w:r>
     </w:p>
-    <w:p/>
     <w:p>
       <w:pPr>
-        <w:pStyle w:val="Heading2"/>
+        <w:spacing w:before="240" w:after="80"/>
       </w:pPr>
       <w:r>
         <w:rPr>
-          <w:color w:val="1E3A8A"/>
+          <w:rFonts w:ascii="Georgia" w:hAnsi="Georgia"/>
+          <w:b/>
+          <w:color w:val="1B365D"/>
+          <w:sz w:val="40"/>
         </w:rPr>
-        <w:t>#3. Holy Forever</w:t>
+        <w:t>#6. God Will Work It Out</w:t>
       </w:r>
     </w:p>
     <w:p>
+      <w:pPr>
+        <w:spacing w:after="160"/>
+      </w:pPr>
       <w:r>
         <w:rPr>
           <w:b/>
+          <w:color w:val="4A5568"/>
+          <w:sz w:val="24"/>
         </w:rPr>
-        <w:t xml:space="preserve">Artist: </w:t>
+        <w:t>Performed by Naomi Raine</w:t>
       </w:r>
+    </w:p>
+    <w:tbl>
+      <w:tblPr>
+        <w:tblW w:type="auto" w:w="0"/>
+        <w:jc w:val="center"/>
+        <w:tblLook w:firstColumn="1" w:firstRow="1" w:lastColumn="0" w:lastRow="0" w:noHBand="0" w:noVBand="1" w:val="04A0"/>
+      </w:tblPr>
+      <w:tblGrid>
+        <w:gridCol w:w="9936"/>
+      </w:tblGrid>
+      <w:tr>
+        <w:tc>
+          <w:tcPr>
+            <w:tcW w:type="dxa" w:w="9792"/>
+            <w:shd w:fill="F0F4F8"/>
+            <w:tcMar>
+              <w:top w:w="140" w:type="dxa"/>
+              <w:bottom w:w="140" w:type="dxa"/>
+              <w:left w:w="180" w:type="dxa"/>
+              <w:right w:w="180" w:type="dxa"/>
+            </w:tcMar>
+          </w:tcPr>
+          <w:p>
+            <w:r>
+              <w:t xml:space="preserve">🔗 Official Link: </w:t>
+            </w:r>
+            <w:hyperlink r:id="rId14">
+              <w:r>
+                <w:rPr>
+                  <w:rColor w:val="0056B3"/>
+                  <w:u w:val="single"/>
+                </w:rPr>
+                <w:t>Watch Official Live Video on YouTube</w:t>
+              </w:r>
+            </w:hyperlink>
+          </w:p>
+        </w:tc>
+      </w:tr>
+    </w:tbl>
+    <w:p>
+      <w:pPr>
+        <w:spacing w:before="360" w:after="200"/>
+      </w:pPr>
       <w:r>
-        <w:t>Chris Tomlin</w:t>
+        <w:rPr>
+          <w:rFonts w:ascii="Georgia" w:hAnsi="Georgia"/>
+          <w:b/>
+          <w:color w:val="2B4C7E"/>
+          <w:sz w:val="28"/>
+        </w:rPr>
+        <w:t>Lyrics</w:t>
+      </w:r>
+    </w:p>
+    <w:p>
+      <w:pPr>
+        <w:spacing w:after="200" w:line="276" w:lineRule="auto"/>
+      </w:pPr>
+      <w:r>
+        <w:rPr>
+          <w:rFonts w:ascii="Calibri" w:hAnsi="Calibri"/>
+          <w:sz w:val="22"/>
+        </w:rPr>
+        <w:t>Before I knew my name, and before I drew a breath</w:t>
         <w:br/>
       </w:r>
       <w:r>
         <w:rPr>
-          <w:b/>
+          <w:rFonts w:ascii="Calibri" w:hAnsi="Calibri"/>
+          <w:sz w:val="22"/>
         </w:rPr>
-        <w:t xml:space="preserve">Official Link: </w:t>
-      </w:r>
-      <w:r>
-        <w:rPr>
-          <w:color w:val="2563EB"/>
-          <w:u w:val="single"/>
-        </w:rPr>
-        <w:t>https://www.youtube.com/watch?v=53zW335tD5g</w:t>
-      </w:r>
-    </w:p>
-    <w:p>
-      <w:r>
-        <w:rPr>
-          <w:b/>
-          <w:color w:val="374151"/>
-        </w:rPr>
-        <w:t>Lyrics:</w:t>
-      </w:r>
-    </w:p>
-    <w:p>
-      <w:r>
-        <w:rPr>
-          <w:rFonts w:ascii="Georgia" w:hAnsi="Georgia"/>
-          <w:color w:val="1F2937"/>
-          <w:sz w:val="21"/>
-        </w:rPr>
-        <w:t>[Verse 1]</w:t>
-        <w:br/>
-        <w:t>A thousand generations</w:t>
-        <w:br/>
-        <w:t>Falling down in worship</w:t>
-        <w:br/>
-        <w:t>To sing the song of ages to the Lamb</w:t>
-        <w:br/>
-        <w:t>And all who've gone before us</w:t>
-        <w:br/>
-        <w:t>And all who will believe</w:t>
-        <w:br/>
-        <w:t>Will sing the song of ages to the Lamb</w:t>
-        <w:br/>
-        <w:br/>
-        <w:t>[Bridge]</w:t>
-        <w:br/>
-        <w:t>Your name is the highest</w:t>
-        <w:br/>
-        <w:t>Your name is the greatest</w:t>
-        <w:br/>
-        <w:t>Your name stands above them all!</w:t>
-        <w:br/>
-        <w:t>All thrones and dominions</w:t>
-        <w:br/>
-        <w:t>All powers and positions</w:t>
-        <w:br/>
-        <w:t>Your name stands above them all!</w:t>
-        <w:br/>
-        <w:br/>
-        <w:t>[Chorus]</w:t>
-        <w:br/>
-        <w:t>And the angels cry, Holy!</w:t>
-        <w:br/>
-        <w:t>All creation cries, Holy!</w:t>
-        <w:br/>
-        <w:t>You are lifted high, Holy</w:t>
-        <w:br/>
-        <w:t>Holy forever!</w:t>
-        <w:br/>
-        <w:br/>
-        <w:t>[Verse 2]</w:t>
-        <w:br/>
-        <w:t>If you've been forgiven</w:t>
-        <w:br/>
-        <w:t>And if you've been redeemed</w:t>
-        <w:br/>
-        <w:t>Sing the song forever to the Lamb!</w:t>
-        <w:br/>
-        <w:t>If you walk in freedom</w:t>
-        <w:br/>
-        <w:t>And if you bear His name</w:t>
-        <w:br/>
-        <w:t>Sing the song forever to the Lamb!</w:t>
-        <w:br/>
-        <w:t>We'll sing the song forever and amen!</w:t>
-        <w:br/>
-        <w:br/>
-        <w:t>[Chorus]</w:t>
-        <w:br/>
-        <w:t>And the angels cry, Holy!</w:t>
-        <w:br/>
-        <w:t>All creation cries, Holy!</w:t>
-        <w:br/>
-        <w:t>You are lifted high, Holy</w:t>
-        <w:br/>
-        <w:t>Holy forever!</w:t>
-        <w:br/>
-        <w:t>Hear your people sing, Holy!</w:t>
-        <w:br/>
-        <w:t>To the King of Kings, Holy!</w:t>
-        <w:br/>
-        <w:t>You will always be, Holy</w:t>
-        <w:br/>
-        <w:t>Holy forever!</w:t>
-        <w:br/>
-        <w:br/>
-        <w:t>[Bridge]</w:t>
-        <w:br/>
-        <w:t>Your name is the highest</w:t>
-        <w:br/>
-        <w:t>Your name is the greatest</w:t>
-        <w:br/>
-        <w:t>Your name stands above them all!</w:t>
-        <w:br/>
-        <w:t>All thrones and dominions</w:t>
-        <w:br/>
-        <w:t>All powers and positions</w:t>
-        <w:br/>
-        <w:t>Your name stands above them all!</w:t>
-        <w:br/>
-        <w:t>Your name is the highest</w:t>
-        <w:br/>
-        <w:t>Your name is the greatest</w:t>
-        <w:br/>
-        <w:t>Your name stands above them all!</w:t>
-        <w:br/>
-        <w:br/>
-        <w:t>[Chorus]</w:t>
-        <w:br/>
-        <w:t>And the angels cry, Holy!</w:t>
-        <w:br/>
-        <w:t>All creation cries, Holy!</w:t>
-        <w:br/>
-        <w:t>You are lifted high, Holy</w:t>
-        <w:br/>
-        <w:t>Holy forever!</w:t>
-        <w:br/>
-        <w:t>Hear your people sing, Holy!</w:t>
-        <w:br/>
-        <w:t>To the King of Kings, Holy!</w:t>
-        <w:br/>
-        <w:t>You will always be, Holy</w:t>
-        <w:br/>
-        <w:t>Holy forever!</w:t>
-        <w:br/>
-        <w:t>You will always be, Holy</w:t>
-        <w:br/>
-        <w:t>Holy forever!</w:t>
-      </w:r>
-    </w:p>
-    <w:p/>
-    <w:p>
-      <w:pPr>
-        <w:pStyle w:val="Heading2"/>
-      </w:pPr>
-      <w:r>
-        <w:rPr>
-          <w:color w:val="1E3A8A"/>
-        </w:rPr>
-        <w:t>#4. Firm Foundation (He Won't)</w:t>
-      </w:r>
-    </w:p>
-    <w:p>
-      <w:r>
-        <w:rPr>
-          <w:b/>
-        </w:rPr>
-        <w:t xml:space="preserve">Artist: </w:t>
-      </w:r>
-      <w:r>
-        <w:t>Cody Carnes</w:t>
+        <w:t>He was making ways for me</w:t>
         <w:br/>
       </w:r>
       <w:r>
         <w:rPr>
-          <w:b/>
+          <w:rFonts w:ascii="Calibri" w:hAnsi="Calibri"/>
+          <w:sz w:val="22"/>
         </w:rPr>
-        <w:t xml:space="preserve">Official Link: </w:t>
-      </w:r>
-      <w:r>
-        <w:rPr>
-          <w:color w:val="2563EB"/>
-          <w:u w:val="single"/>
-        </w:rPr>
-        <w:t>https://www.youtube.com/watch?v=gTj7Ue6r2gQ</w:t>
-      </w:r>
-    </w:p>
-    <w:p>
-      <w:r>
-        <w:rPr>
-          <w:b/>
-          <w:color w:val="374151"/>
-        </w:rPr>
-        <w:t>Lyrics:</w:t>
-      </w:r>
-    </w:p>
-    <w:p>
-      <w:r>
-        <w:rPr>
-          <w:rFonts w:ascii="Georgia" w:hAnsi="Georgia"/>
-          <w:color w:val="1F2937"/>
-          <w:sz w:val="21"/>
-        </w:rPr>
-        <w:t>[Chorus]</w:t>
-        <w:br/>
-        <w:t>Christ is my firm foundation</w:t>
-        <w:br/>
-        <w:t>The rock on which I stand</w:t>
-        <w:br/>
-        <w:t>When everything around me is shaken</w:t>
-        <w:br/>
-        <w:t>I've never been more glad</w:t>
-        <w:br/>
-        <w:t>That I put my faith in Jesus</w:t>
-        <w:br/>
-        <w:t>'Cause He's never let me down</w:t>
-        <w:br/>
-        <w:t>He's faithful through generations</w:t>
-        <w:br/>
-        <w:t>So why would He fail now?</w:t>
-        <w:br/>
-        <w:br/>
-        <w:t>[Tag]</w:t>
-        <w:br/>
-        <w:t>He won't, He won't</w:t>
-        <w:br/>
-        <w:t>He won't fail</w:t>
-        <w:br/>
-        <w:t>He won't fail</w:t>
-        <w:br/>
-        <w:br/>
-        <w:t>[Verse]</w:t>
-        <w:br/>
-        <w:t>I've still got joy in chaos</w:t>
-        <w:br/>
-        <w:t>I've got peace that makes no sense</w:t>
-        <w:br/>
-        <w:t>So I won't be going under</w:t>
-        <w:br/>
-        <w:t>I'm not held by my own strength</w:t>
-        <w:br/>
-        <w:t>'Cause I've built my life on Jesus</w:t>
-        <w:br/>
-        <w:t>He's never let me down</w:t>
-        <w:br/>
-        <w:t>He's faithful in every season</w:t>
-        <w:br/>
-        <w:t>So why would He fail now?</w:t>
-        <w:br/>
-        <w:br/>
-        <w:t>[Tag]</w:t>
-        <w:br/>
-        <w:t>He won't, He won't</w:t>
-        <w:br/>
-        <w:t>He won't fail</w:t>
-        <w:br/>
-        <w:t>He won't fail</w:t>
-        <w:br/>
-        <w:t>He won't, He won't</w:t>
-        <w:br/>
-        <w:t>He won't fail</w:t>
-        <w:br/>
-        <w:t>He won't fail</w:t>
-        <w:br/>
-        <w:br/>
-        <w:t>[Bridge]</w:t>
-        <w:br/>
-        <w:t>Rain came and wind blew</w:t>
-        <w:br/>
-        <w:t>But my house was built on You</w:t>
-        <w:br/>
-        <w:t>I'm safe with You</w:t>
-        <w:br/>
-        <w:t>I'm going to make it through</w:t>
-        <w:br/>
-        <w:t>Rain came and wind blew</w:t>
-        <w:br/>
-        <w:t>But my house was built on You</w:t>
-        <w:br/>
-        <w:t>I'm safe with You</w:t>
-        <w:br/>
-        <w:t>I'm going to make it through</w:t>
-        <w:br/>
-        <w:t>Yeah, I'm going to make it through</w:t>
-        <w:br/>
-        <w:t>'Cause I'm standing strong on You</w:t>
-        <w:br/>
-        <w:t>Yeah, I'm going to make it through</w:t>
-        <w:br/>
-        <w:t>'Cause my house is built on You</w:t>
-        <w:br/>
-        <w:br/>
-        <w:t>[Chorus]</w:t>
-        <w:br/>
-        <w:t>Christ is my firm foundation</w:t>
-        <w:br/>
-        <w:t>The rock on which I stand</w:t>
-        <w:br/>
-        <w:t>When everything around me is shaken</w:t>
-        <w:br/>
-        <w:t>I've never been more glad</w:t>
-        <w:br/>
-        <w:t>That I put my faith in Jesus</w:t>
-        <w:br/>
-        <w:t>'Cause He's never let me down</w:t>
-        <w:br/>
-        <w:t>He's faithful through generations</w:t>
-        <w:br/>
-        <w:t>So why would He fail now?</w:t>
-        <w:br/>
-        <w:br/>
-        <w:t>[Tag]</w:t>
-        <w:br/>
-        <w:t>He won't, He won't</w:t>
-        <w:br/>
-        <w:t>He won't fail</w:t>
-        <w:br/>
-        <w:t>He won't fail</w:t>
-      </w:r>
-    </w:p>
-    <w:p/>
-    <w:p>
-      <w:pPr>
-        <w:pStyle w:val="Heading2"/>
-      </w:pPr>
-      <w:r>
-        <w:rPr>
-          <w:color w:val="1E3A8A"/>
-        </w:rPr>
-        <w:t>#5. Jireh</w:t>
-      </w:r>
-    </w:p>
-    <w:p>
-      <w:r>
-        <w:rPr>
-          <w:b/>
-        </w:rPr>
-        <w:t xml:space="preserve">Artist: </w:t>
-      </w:r>
-      <w:r>
-        <w:t>Elevation Worship &amp; Maverick City Music (feat. Chandler Moore &amp; Naomi Raine)</w:t>
+        <w:t>Now and everyday, and in each and every step</w:t>
         <w:br/>
       </w:r>
       <w:r>
         <w:rPr>
-          <w:b/>
+          <w:rFonts w:ascii="Calibri" w:hAnsi="Calibri"/>
+          <w:sz w:val="22"/>
         </w:rPr>
-        <w:t xml:space="preserve">Official Link: </w:t>
+        <w:t>He is making ways for me</w:t>
+        <w:br/>
       </w:r>
       <w:r>
         <w:rPr>
-          <w:color w:val="2563EB"/>
-          <w:u w:val="single"/>
+          <w:rFonts w:ascii="Calibri" w:hAnsi="Calibri"/>
+          <w:sz w:val="22"/>
         </w:rPr>
-        <w:t>https://www.youtube.com/watch?v=1V_xRb0x94I</w:t>
+        <w:t>When my heart is full of doubt</w:t>
+        <w:br/>
+      </w:r>
+      <w:r>
+        <w:rPr>
+          <w:rFonts w:ascii="Calibri" w:hAnsi="Calibri"/>
+          <w:sz w:val="22"/>
+        </w:rPr>
+        <w:t>Feels like faith is running out</w:t>
+        <w:br/>
+      </w:r>
+      <w:r>
+        <w:rPr>
+          <w:rFonts w:ascii="Calibri" w:hAnsi="Calibri"/>
+          <w:sz w:val="22"/>
+        </w:rPr>
+        <w:t>I'm too far to turn around</w:t>
+        <w:br/>
       </w:r>
     </w:p>
     <w:p>
+      <w:pPr>
+        <w:spacing w:before="160" w:after="40"/>
+      </w:pPr>
       <w:r>
         <w:rPr>
           <w:b/>
-          <w:color w:val="374151"/>
+          <w:color w:val="718096"/>
+          <w:sz w:val="20"/>
         </w:rPr>
-        <w:t>Lyrics:</w:t>
+        <w:t>[Verse 1]</w:t>
       </w:r>
     </w:p>
     <w:p>
+      <w:pPr>
+        <w:spacing w:after="200" w:line="276" w:lineRule="auto"/>
+      </w:pPr>
       <w:r>
         <w:rPr>
-          <w:rFonts w:ascii="Georgia" w:hAnsi="Georgia"/>
-          <w:color w:val="1F2937"/>
-          <w:sz w:val="21"/>
+          <w:rFonts w:ascii="Calibri" w:hAnsi="Calibri"/>
+          <w:sz w:val="22"/>
         </w:rPr>
-        <w:t>[Verse 1]</w:t>
+        <w:t>I know, I know that God will work it out</w:t>
         <w:br/>
-        <w:t>I'll never be more loved than I am right now</w:t>
+      </w:r>
+      <w:r>
+        <w:rPr>
+          <w:rFonts w:ascii="Calibri" w:hAnsi="Calibri"/>
+          <w:sz w:val="22"/>
+        </w:rPr>
+        <w:t>God will work it out</w:t>
         <w:br/>
-        <w:t>Wasn't holding You up</w:t>
+      </w:r>
+      <w:r>
+        <w:rPr>
+          <w:rFonts w:ascii="Calibri" w:hAnsi="Calibri"/>
+          <w:sz w:val="22"/>
+        </w:rPr>
+        <w:t>One thing I know, one thing I've found</w:t>
         <w:br/>
-        <w:t>So, there's nothing I can do to let You down</w:t>
+      </w:r>
+      <w:r>
+        <w:rPr>
+          <w:rFonts w:ascii="Calibri" w:hAnsi="Calibri"/>
+          <w:sz w:val="22"/>
+        </w:rPr>
+        <w:t>My God will work it out</w:t>
         <w:br/>
-        <w:t>It doesn't take a trophy to make You proud</w:t>
-        <w:br/>
-        <w:t>I'll never be more loved than I am right now</w:t>
-        <w:br/>
-        <w:br/>
-        <w:t>[Verse 2]</w:t>
-        <w:br/>
-        <w:t>Going through a storm, but I won't go down</w:t>
-        <w:br/>
-        <w:t>I hear Your voice carried in the rhythm of the wind</w:t>
-        <w:br/>
-        <w:t>To call me out</w:t>
-        <w:br/>
-        <w:t>You would cross an ocean so I wouldn't drown</w:t>
-        <w:br/>
-        <w:t>You've never been closer than You are right now</w:t>
-        <w:br/>
-        <w:br/>
-        <w:t>[Chorus]</w:t>
-        <w:br/>
-        <w:t>Jireh, You are enough</w:t>
-        <w:br/>
-        <w:t>Jireh, You are enough</w:t>
-        <w:br/>
-        <w:t>I will be content in every circumstance</w:t>
-        <w:br/>
-        <w:t>Jireh, You are enough</w:t>
-        <w:br/>
-        <w:br/>
-        <w:t>[Tag]</w:t>
-        <w:br/>
-        <w:t>Forever enough, always enough</w:t>
-        <w:br/>
-        <w:t>More than enough</w:t>
-        <w:br/>
-        <w:br/>
-        <w:t>[Verse 3]</w:t>
-        <w:br/>
-        <w:t>I don't wanna forget how I feel right now</w:t>
-        <w:br/>
-        <w:t>On the mountaintop, I can see so clear what it's all about</w:t>
-        <w:br/>
-        <w:t>Stay by my side when the sun goes down</w:t>
-        <w:br/>
-        <w:t>Don't wanna forget how I feel right now</w:t>
-        <w:br/>
-        <w:br/>
-        <w:t>[Bridge 1]</w:t>
-        <w:br/>
-        <w:t>I'm already loved, I'm already chosen</w:t>
-        <w:br/>
-        <w:t>I know who I am, I know what You've spoken</w:t>
-        <w:br/>
-        <w:t>I'm already loved, more than I could imagine</w:t>
-        <w:br/>
-        <w:t>And that is enough</w:t>
-        <w:br/>
-        <w:br/>
-        <w:t>[Tag]</w:t>
-        <w:br/>
-        <w:t>That is enough</w:t>
-        <w:br/>
-        <w:br/>
-        <w:t>[Vamp]</w:t>
-        <w:br/>
-        <w:t>That is enough</w:t>
-        <w:br/>
-        <w:t>You are enough</w:t>
-        <w:br/>
-        <w:t>So I am enough</w:t>
-        <w:br/>
-        <w:br/>
-        <w:t>[Bridge 2]</w:t>
-        <w:br/>
-        <w:t>If He dresses the lilies with beauty and splendor</w:t>
-        <w:br/>
-        <w:t>How much more will He clothe you?</w:t>
-        <w:br/>
-        <w:t>How much more will He clothe you?</w:t>
-        <w:br/>
-        <w:t>If He watches over every sparrow</w:t>
-        <w:br/>
-        <w:t>How much more does He love you?</w:t>
-        <w:br/>
-        <w:t>How much more does He love you?</w:t>
-        <w:br/>
-        <w:br/>
-        <w:t>[Bridge 3]</w:t>
-        <w:br/>
-        <w:t>More than you ask, think, or imagine</w:t>
-        <w:br/>
-        <w:t>According to His power working in us</w:t>
-        <w:br/>
-        <w:t>It's more than enough</w:t>
       </w:r>
     </w:p>
-    <w:p/>
+    <w:p>
+      <w:pPr>
+        <w:spacing w:before="160" w:after="40"/>
+      </w:pPr>
+      <w:r>
+        <w:rPr>
+          <w:b/>
+          <w:color w:val="718096"/>
+          <w:sz w:val="20"/>
+        </w:rPr>
+        <w:t>[Chorus]</w:t>
+      </w:r>
+    </w:p>
+    <w:p>
+      <w:pPr>
+        <w:spacing w:after="200" w:line="276" w:lineRule="auto"/>
+      </w:pPr>
+      <w:r>
+        <w:rPr>
+          <w:rFonts w:ascii="Calibri" w:hAnsi="Calibri"/>
+          <w:sz w:val="22"/>
+        </w:rPr>
+        <w:t>I've been pushing past the fear, I've been fighting to believe</w:t>
+        <w:br/>
+      </w:r>
+      <w:r>
+        <w:rPr>
+          <w:rFonts w:ascii="Calibri" w:hAnsi="Calibri"/>
+          <w:sz w:val="22"/>
+        </w:rPr>
+        <w:t>He is making ways for me</w:t>
+        <w:br/>
+      </w:r>
+      <w:r>
+        <w:rPr>
+          <w:rFonts w:ascii="Calibri" w:hAnsi="Calibri"/>
+          <w:sz w:val="22"/>
+        </w:rPr>
+        <w:t>And He won't let me down, never ever leave</w:t>
+        <w:br/>
+      </w:r>
+      <w:r>
+        <w:rPr>
+          <w:rFonts w:ascii="Calibri" w:hAnsi="Calibri"/>
+          <w:sz w:val="22"/>
+        </w:rPr>
+        <w:t>He's still making ways for me</w:t>
+        <w:br/>
+      </w:r>
+      <w:r>
+        <w:rPr>
+          <w:rFonts w:ascii="Calibri" w:hAnsi="Calibri"/>
+          <w:sz w:val="22"/>
+        </w:rPr>
+        <w:t>He's still making ways</w:t>
+        <w:br/>
+      </w:r>
+    </w:p>
+    <w:p>
+      <w:pPr>
+        <w:spacing w:before="160" w:after="40"/>
+      </w:pPr>
+      <w:r>
+        <w:rPr>
+          <w:b/>
+          <w:color w:val="718096"/>
+          <w:sz w:val="20"/>
+        </w:rPr>
+        <w:t>[Verse 2]</w:t>
+      </w:r>
+    </w:p>
+    <w:p>
+      <w:pPr>
+        <w:spacing w:after="200" w:line="276" w:lineRule="auto"/>
+      </w:pPr>
+      <w:r>
+        <w:rPr>
+          <w:rFonts w:ascii="Calibri" w:hAnsi="Calibri"/>
+          <w:sz w:val="22"/>
+        </w:rPr>
+        <w:t>Be still, be still my soul</w:t>
+        <w:br/>
+      </w:r>
+      <w:r>
+        <w:rPr>
+          <w:rFonts w:ascii="Calibri" w:hAnsi="Calibri"/>
+          <w:sz w:val="22"/>
+        </w:rPr>
+        <w:t>Be still and know</w:t>
+        <w:br/>
+      </w:r>
+      <w:r>
+        <w:rPr>
+          <w:rFonts w:ascii="Calibri" w:hAnsi="Calibri"/>
+          <w:sz w:val="22"/>
+        </w:rPr>
+        <w:t>My God, He's in control</w:t>
+        <w:br/>
+      </w:r>
+      <w:r>
+        <w:rPr>
+          <w:rFonts w:ascii="Calibri" w:hAnsi="Calibri"/>
+          <w:sz w:val="22"/>
+        </w:rPr>
+        <w:t>He's in control</w:t>
+        <w:br/>
+      </w:r>
+      <w:r>
+        <w:rPr>
+          <w:rFonts w:ascii="Calibri" w:hAnsi="Calibri"/>
+          <w:sz w:val="22"/>
+        </w:rPr>
+        <w:t>God is working now</w:t>
+        <w:br/>
+      </w:r>
+      <w:r>
+        <w:rPr>
+          <w:rFonts w:ascii="Calibri" w:hAnsi="Calibri"/>
+          <w:sz w:val="22"/>
+        </w:rPr>
+        <w:t>God is working now</w:t>
+        <w:br/>
+      </w:r>
+      <w:r>
+        <w:rPr>
+          <w:rFonts w:ascii="Calibri" w:hAnsi="Calibri"/>
+          <w:sz w:val="22"/>
+        </w:rPr>
+        <w:t>One thing I know</w:t>
+        <w:br/>
+      </w:r>
+      <w:r>
+        <w:rPr>
+          <w:rFonts w:ascii="Calibri" w:hAnsi="Calibri"/>
+          <w:sz w:val="22"/>
+        </w:rPr>
+        <w:t>If it's one thing I've found</w:t>
+        <w:br/>
+      </w:r>
+      <w:r>
+        <w:rPr>
+          <w:rFonts w:ascii="Calibri" w:hAnsi="Calibri"/>
+          <w:sz w:val="22"/>
+        </w:rPr>
+        <w:t>God is working now</w:t>
+        <w:br/>
+      </w:r>
+    </w:p>
+    <w:p>
+      <w:pPr>
+        <w:spacing w:before="160" w:after="40"/>
+      </w:pPr>
+      <w:r>
+        <w:rPr>
+          <w:b/>
+          <w:color w:val="718096"/>
+          <w:sz w:val="20"/>
+        </w:rPr>
+        <w:t>[Bridge]</w:t>
+      </w:r>
+    </w:p>
+    <w:p>
+      <w:pPr>
+        <w:spacing w:after="200" w:line="276" w:lineRule="auto"/>
+      </w:pPr>
+      <w:r>
+        <w:rPr>
+          <w:rFonts w:ascii="Calibri" w:hAnsi="Calibri"/>
+          <w:sz w:val="22"/>
+        </w:rPr>
+        <w:t>I know, I know that God will work it out</w:t>
+        <w:br/>
+      </w:r>
+      <w:r>
+        <w:rPr>
+          <w:rFonts w:ascii="Calibri" w:hAnsi="Calibri"/>
+          <w:sz w:val="22"/>
+        </w:rPr>
+        <w:t>God will work it out</w:t>
+        <w:br/>
+      </w:r>
+      <w:r>
+        <w:rPr>
+          <w:rFonts w:ascii="Calibri" w:hAnsi="Calibri"/>
+          <w:sz w:val="22"/>
+        </w:rPr>
+        <w:t>One thing I know, one thing I've found</w:t>
+        <w:br/>
+      </w:r>
+      <w:r>
+        <w:rPr>
+          <w:rFonts w:ascii="Calibri" w:hAnsi="Calibri"/>
+          <w:sz w:val="22"/>
+        </w:rPr>
+        <w:t>My God will work it out</w:t>
+        <w:br/>
+      </w:r>
+    </w:p>
+    <w:p>
+      <w:pPr>
+        <w:spacing w:before="160" w:after="40"/>
+      </w:pPr>
+      <w:r>
+        <w:rPr>
+          <w:b/>
+          <w:color w:val="718096"/>
+          <w:sz w:val="20"/>
+        </w:rPr>
+        <w:t>[Chorus]</w:t>
+      </w:r>
+    </w:p>
     <w:sectPr>
       <w:pgSz w:w="12240" w:h="15840"/>
-      <w:pgMar w:top="1440" w:right="1440" w:bottom="1440" w:left="1440" w:header="720" w:footer="720" w:gutter="0"/>
+      <w:pgMar w:top="1152" w:right="1152" w:bottom="1152" w:left="1152" w:header="720" w:footer="720" w:gutter="0"/>
       <w:cols w:space="720"/>
       <w:docGrid w:linePitch="360"/>
     </w:sectPr>
@@ -1503,6 +3690,11 @@
     <w:name w:val="Normal"/>
     <w:qFormat/>
     <w:rsid w:val="00FC693F"/>
+    <w:rPr>
+      <w:rFonts w:ascii="Calibri" w:hAnsi="Calibri"/>
+      <w:color w:val="333333"/>
+      <w:sz w:val="22"/>
+    </w:rPr>
   </w:style>
   <w:style w:type="paragraph" w:styleId="Header">
     <w:name w:val="header"/>

</xml_diff>